<commit_message>
Fill AI usage document with actual interaction excerpts and concrete records
</commit_message>
<xml_diff>
--- a/支撑材料/AI工具使用详情.docx
+++ b/支撑材料/AI工具使用详情.docx
@@ -5,7 +5,6 @@
     <w:p>
       <w:pPr>
         <w:pStyle w:val="Title"/>
-        <w:spacing w:after="260"/>
         <w:jc w:val="center"/>
       </w:pPr>
       <w:r>
@@ -14,7 +13,7 @@
     </w:p>
     <w:p>
       <w:pPr>
-        <w:spacing w:after="200"/>
+        <w:spacing w:after="120"/>
         <w:jc w:val="center"/>
       </w:pPr>
       <w:r>
@@ -38,7 +37,7 @@
           <w:color w:val="000000"/>
           <w:sz w:val="21"/>
         </w:rPr>
-        <w:t>本队使用 Deepseek Harness 与 Deepseek v4.1 flash 组合辅助检查源代码语法并进行部分程序调试；使用 Codex 与 GPT6-Astra 组合辅助理解题目、检索参考文献、检查建模结果和整理公式。具体使用记录、采纳修改情况及人工核验信息列于本文件。</w:t>
+        <w:t>本队使用 Deepseek Harness 与 Deepseek v4.1 flash 辅助代码语法检查和部分程序调试，使用 Codex 与 GPT6-Astra 辅助题意理解、文献检索、模型与结果检查、公式整理，以及绘图和提交材料整理。AI参与内容及具体处理情况如下。</w:t>
       </w:r>
     </w:p>
     <w:p>
@@ -65,16 +64,16 @@
           <w:insideV w:val="single" w:sz="6" w:color="D9D9D9"/>
         </w:tblBorders>
         <w:tblCellMar>
-          <w:top w:w="125" w:type="dxa"/>
-          <w:left w:w="125" w:type="dxa"/>
-          <w:bottom w:w="125" w:type="dxa"/>
-          <w:right w:w="125" w:type="dxa"/>
+          <w:top w:w="115" w:type="dxa"/>
+          <w:left w:w="115" w:type="dxa"/>
+          <w:bottom w:w="115" w:type="dxa"/>
+          <w:right w:w="115" w:type="dxa"/>
         </w:tblCellMar>
       </w:tblPr>
       <w:tblGrid>
-        <w:gridCol w:w="2381"/>
-        <w:gridCol w:w="2891"/>
-        <w:gridCol w:w="4365"/>
+        <w:gridCol w:w="2098"/>
+        <w:gridCol w:w="2721"/>
+        <w:gridCol w:w="4819"/>
       </w:tblGrid>
       <w:tr>
         <w:trPr>
@@ -83,391 +82,7 @@
         </w:trPr>
         <w:tc>
           <w:tcPr>
-            <w:tcW w:type="dxa" w:w="2381"/>
-            <w:vAlign w:val="center"/>
-            <w:shd w:fill="E8EEF3"/>
-          </w:tcPr>
-          <w:p>
-            <w:pPr>
-              <w:spacing w:line="264" w:lineRule="auto" w:after="0" w:before="0"/>
-              <w:jc w:val="center"/>
-            </w:pPr>
-            <w:r>
-              <w:rPr>
-                <w:rFonts w:ascii="Times New Roman" w:hAnsi="Times New Roman" w:eastAsia="宋体"/>
-                <w:b/>
-                <w:color w:val="000000"/>
-                <w:sz w:val="22"/>
-              </w:rPr>
-              <w:t>工具及模型</w:t>
-            </w:r>
-          </w:p>
-        </w:tc>
-        <w:tc>
-          <w:tcPr>
-            <w:tcW w:type="dxa" w:w="2891"/>
-            <w:vAlign w:val="center"/>
-            <w:shd w:fill="E8EEF3"/>
-          </w:tcPr>
-          <w:p>
-            <w:pPr>
-              <w:spacing w:line="264" w:lineRule="auto" w:after="0" w:before="0"/>
-              <w:jc w:val="center"/>
-            </w:pPr>
-            <w:r>
-              <w:rPr>
-                <w:rFonts w:ascii="Times New Roman" w:hAnsi="Times New Roman" w:eastAsia="宋体"/>
-                <w:b/>
-                <w:color w:val="000000"/>
-                <w:sz w:val="22"/>
-              </w:rPr>
-              <w:t>精确版本记录</w:t>
-            </w:r>
-          </w:p>
-        </w:tc>
-        <w:tc>
-          <w:tcPr>
-            <w:tcW w:type="dxa" w:w="4365"/>
-            <w:vAlign w:val="center"/>
-            <w:shd w:fill="E8EEF3"/>
-          </w:tcPr>
-          <w:p>
-            <w:pPr>
-              <w:spacing w:line="264" w:lineRule="auto" w:after="0" w:before="0"/>
-              <w:jc w:val="center"/>
-            </w:pPr>
-            <w:r>
-              <w:rPr>
-                <w:rFonts w:ascii="Times New Roman" w:hAnsi="Times New Roman" w:eastAsia="宋体"/>
-                <w:b/>
-                <w:color w:val="000000"/>
-                <w:sz w:val="22"/>
-              </w:rPr>
-              <w:t>主要用途</w:t>
-            </w:r>
-          </w:p>
-        </w:tc>
-      </w:tr>
-      <w:tr>
-        <w:trPr>
-          <w:cantSplit/>
-        </w:trPr>
-        <w:tc>
-          <w:tcPr>
-            <w:tcW w:type="dxa" w:w="2381"/>
-            <w:vAlign w:val="center"/>
-          </w:tcPr>
-          <w:p>
-            <w:pPr>
-              <w:spacing w:line="264" w:lineRule="auto" w:after="0" w:before="0"/>
-            </w:pPr>
-            <w:r>
-              <w:rPr>
-                <w:rFonts w:ascii="Times New Roman" w:hAnsi="Times New Roman" w:eastAsia="宋体"/>
-                <w:b w:val="0"/>
-                <w:color w:val="000000"/>
-                <w:sz w:val="22"/>
-              </w:rPr>
-              <w:t>Deepseek Harness</w:t>
-            </w:r>
-            <w:r>
-              <w:br/>
-            </w:r>
-            <w:r>
-              <w:rPr>
-                <w:rFonts w:ascii="Times New Roman" w:hAnsi="Times New Roman" w:eastAsia="宋体"/>
-                <w:b w:val="0"/>
-                <w:color w:val="000000"/>
-                <w:sz w:val="22"/>
-              </w:rPr>
-              <w:t>与 Deepseek v4.1 flash</w:t>
-            </w:r>
-          </w:p>
-        </w:tc>
-        <w:tc>
-          <w:tcPr>
-            <w:tcW w:type="dxa" w:w="2891"/>
-            <w:vAlign w:val="center"/>
-          </w:tcPr>
-          <w:p>
-            <w:pPr>
-              <w:spacing w:line="264" w:lineRule="auto" w:after="0" w:before="0"/>
-            </w:pPr>
-            <w:r>
-              <w:rPr>
-                <w:rFonts w:ascii="Times New Roman" w:hAnsi="Times New Roman" w:eastAsia="宋体"/>
-                <w:b w:val="0"/>
-                <w:color w:val="000000"/>
-                <w:sz w:val="22"/>
-              </w:rPr>
-              <w:t>模型：Deepseek v4.1 flash</w:t>
-            </w:r>
-            <w:r>
-              <w:br/>
-            </w:r>
-            <w:r>
-              <w:rPr>
-                <w:rFonts w:ascii="Times New Roman" w:hAnsi="Times New Roman" w:eastAsia="宋体"/>
-                <w:b w:val="0"/>
-                <w:color w:val="000000"/>
-                <w:sz w:val="22"/>
-              </w:rPr>
-              <w:t>客户端版本：待填写</w:t>
-            </w:r>
-          </w:p>
-        </w:tc>
-        <w:tc>
-          <w:tcPr>
-            <w:tcW w:type="dxa" w:w="4365"/>
-            <w:vAlign w:val="center"/>
-          </w:tcPr>
-          <w:p>
-            <w:pPr>
-              <w:spacing w:line="264" w:lineRule="auto" w:after="0" w:before="0"/>
-            </w:pPr>
-            <w:r>
-              <w:rPr>
-                <w:rFonts w:ascii="Times New Roman" w:hAnsi="Times New Roman" w:eastAsia="宋体"/>
-                <w:b w:val="0"/>
-                <w:color w:val="000000"/>
-                <w:sz w:val="22"/>
-              </w:rPr>
-              <w:t>检查已编写源代码的语法问题；结合报错信息和代码片段辅助部分程序调试。</w:t>
-            </w:r>
-          </w:p>
-        </w:tc>
-      </w:tr>
-      <w:tr>
-        <w:trPr>
-          <w:cantSplit/>
-        </w:trPr>
-        <w:tc>
-          <w:tcPr>
-            <w:tcW w:type="dxa" w:w="2381"/>
-            <w:vAlign w:val="center"/>
-          </w:tcPr>
-          <w:p>
-            <w:pPr>
-              <w:spacing w:line="264" w:lineRule="auto" w:after="0" w:before="0"/>
-            </w:pPr>
-            <w:r>
-              <w:rPr>
-                <w:rFonts w:ascii="Times New Roman" w:hAnsi="Times New Roman" w:eastAsia="宋体"/>
-                <w:b w:val="0"/>
-                <w:color w:val="000000"/>
-                <w:sz w:val="22"/>
-              </w:rPr>
-              <w:t>Codex</w:t>
-            </w:r>
-            <w:r>
-              <w:br/>
-            </w:r>
-            <w:r>
-              <w:rPr>
-                <w:rFonts w:ascii="Times New Roman" w:hAnsi="Times New Roman" w:eastAsia="宋体"/>
-                <w:b w:val="0"/>
-                <w:color w:val="000000"/>
-                <w:sz w:val="22"/>
-              </w:rPr>
-              <w:t>与 GPT6-Astra</w:t>
-            </w:r>
-          </w:p>
-        </w:tc>
-        <w:tc>
-          <w:tcPr>
-            <w:tcW w:type="dxa" w:w="2891"/>
-            <w:vAlign w:val="center"/>
-          </w:tcPr>
-          <w:p>
-            <w:pPr>
-              <w:spacing w:line="264" w:lineRule="auto" w:after="0" w:before="0"/>
-            </w:pPr>
-            <w:r>
-              <w:rPr>
-                <w:rFonts w:ascii="Times New Roman" w:hAnsi="Times New Roman" w:eastAsia="宋体"/>
-                <w:b w:val="0"/>
-                <w:color w:val="000000"/>
-                <w:sz w:val="22"/>
-              </w:rPr>
-              <w:t>模型：GPT6-Astra</w:t>
-            </w:r>
-            <w:r>
-              <w:br/>
-            </w:r>
-            <w:r>
-              <w:rPr>
-                <w:rFonts w:ascii="Times New Roman" w:hAnsi="Times New Roman" w:eastAsia="宋体"/>
-                <w:b w:val="0"/>
-                <w:color w:val="000000"/>
-                <w:sz w:val="22"/>
-              </w:rPr>
-              <w:t>客户端版本：待填写</w:t>
-            </w:r>
-          </w:p>
-        </w:tc>
-        <w:tc>
-          <w:tcPr>
-            <w:tcW w:type="dxa" w:w="4365"/>
-            <w:vAlign w:val="center"/>
-          </w:tcPr>
-          <w:p>
-            <w:pPr>
-              <w:spacing w:line="264" w:lineRule="auto" w:after="0" w:before="0"/>
-            </w:pPr>
-            <w:r>
-              <w:rPr>
-                <w:rFonts w:ascii="Times New Roman" w:hAnsi="Times New Roman" w:eastAsia="宋体"/>
-                <w:b w:val="0"/>
-                <w:color w:val="000000"/>
-                <w:sz w:val="22"/>
-              </w:rPr>
-              <w:t>理解题目；检索参考文献；检查建模结果；整理公式与符号说明。</w:t>
-            </w:r>
-          </w:p>
-        </w:tc>
-      </w:tr>
-    </w:tbl>
-    <w:p>
-      <w:pPr>
-        <w:spacing w:after="40"/>
-      </w:pPr>
-      <w:r>
-        <w:rPr>
-          <w:rFonts w:ascii="Times New Roman" w:hAnsi="Times New Roman" w:eastAsia="宋体"/>
-          <w:b w:val="0"/>
-          <w:color w:val="000000"/>
-          <w:sz w:val="21"/>
-        </w:rPr>
-      </w:r>
-    </w:p>
-    <w:p>
-      <w:pPr>
-        <w:spacing w:after="120"/>
-      </w:pPr>
-      <w:r>
-        <w:rPr>
-          <w:rFonts w:ascii="Times New Roman" w:hAnsi="Times New Roman" w:eastAsia="宋体"/>
-          <w:b w:val="0"/>
-          <w:color w:val="000000"/>
-          <w:sz w:val="21"/>
-        </w:rPr>
-        <w:t>使用日期或时段：待填写。模型名称与版本须按实际使用界面或记录核对；如使用过不同版本，逐项增补。</w:t>
-      </w:r>
-    </w:p>
-    <w:p>
-      <w:pPr>
-        <w:pStyle w:val="Heading2"/>
-        <w:keepNext/>
-      </w:pPr>
-      <w:r>
-        <w:t>交互方式及记录方法</w:t>
-      </w:r>
-    </w:p>
-    <w:p>
-      <w:pPr>
-        <w:spacing w:after="120"/>
-      </w:pPr>
-      <w:r>
-        <w:rPr>
-          <w:rFonts w:ascii="Times New Roman" w:hAnsi="Times New Roman" w:eastAsia="宋体"/>
-          <w:b w:val="0"/>
-          <w:color w:val="000000"/>
-          <w:sz w:val="21"/>
-        </w:rPr>
-        <w:t>交互方式：待填写实际使用形式，例如文字对话、提交报错信息或附代码片段。涉及上传文件时，补充文件名称及其用途。</w:t>
-      </w:r>
-    </w:p>
-    <w:p>
-      <w:pPr>
-        <w:spacing w:after="120"/>
-      </w:pPr>
-      <w:r>
-        <w:rPr>
-          <w:rFonts w:ascii="Times New Roman" w:hAnsi="Times New Roman" w:eastAsia="宋体"/>
-          <w:b w:val="0"/>
-          <w:color w:val="000000"/>
-          <w:sz w:val="21"/>
-        </w:rPr>
-        <w:t>典型交互记录保留完整提示词、AI 回复、队伍处理方式和人工核验过程。后附三张记录表可直接填写或粘贴聊天截图；记录较长时可续页，并在表内注明续页位置。</w:t>
-      </w:r>
-    </w:p>
-    <w:p>
-      <w:pPr>
-        <w:spacing w:after="120"/>
-      </w:pPr>
-      <w:r>
-        <w:rPr>
-          <w:rFonts w:ascii="Times New Roman" w:hAnsi="Times New Roman" w:eastAsia="宋体"/>
-          <w:b w:val="0"/>
-          <w:color w:val="000000"/>
-          <w:sz w:val="21"/>
-        </w:rPr>
-        <w:t>填写说明：本文件中的“待填写”“待本队确认”栏目，以及未勾选的确认项，须由本队按真实记录补齐或核实后再定稿。</w:t>
-      </w:r>
-    </w:p>
-    <w:p>
-      <w:r>
-        <w:br w:type="page"/>
-      </w:r>
-    </w:p>
-    <w:p>
-      <w:pPr>
-        <w:pStyle w:val="Heading1"/>
-        <w:keepNext/>
-      </w:pPr>
-      <w:r>
-        <w:t>二 分环节使用记录</w:t>
-      </w:r>
-    </w:p>
-    <w:p>
-      <w:pPr>
-        <w:spacing w:after="120"/>
-      </w:pPr>
-      <w:r>
-        <w:rPr>
-          <w:rFonts w:ascii="Times New Roman" w:hAnsi="Times New Roman" w:eastAsia="宋体"/>
-          <w:b w:val="0"/>
-          <w:color w:val="000000"/>
-          <w:sz w:val="21"/>
-        </w:rPr>
-        <w:t>逐项登记七个环节的实际使用情况。标为“已使用”的内容对应已说明的用途；需要进一步核实的环节由本队补充使用情况与记录位置。</w:t>
-      </w:r>
-    </w:p>
-    <w:tbl>
-      <w:tblPr>
-        <w:tblW w:type="auto" w:w="0"/>
-        <w:jc w:val="center"/>
-        <w:tblLayout w:type="fixed"/>
-        <w:tblLook w:firstColumn="1" w:firstRow="1" w:lastColumn="0" w:lastRow="0" w:noHBand="0" w:noVBand="1" w:val="04A0"/>
-        <w:tblBorders>
-          <w:top w:val="single" w:sz="6" w:color="D9D9D9"/>
-          <w:left w:val="single" w:sz="6" w:color="D9D9D9"/>
-          <w:bottom w:val="single" w:sz="6" w:color="D9D9D9"/>
-          <w:right w:val="single" w:sz="6" w:color="D9D9D9"/>
-          <w:insideH w:val="single" w:sz="6" w:color="D9D9D9"/>
-          <w:insideV w:val="single" w:sz="6" w:color="D9D9D9"/>
-        </w:tblBorders>
-        <w:tblCellMar>
-          <w:top w:w="110" w:type="dxa"/>
-          <w:left w:w="110" w:type="dxa"/>
-          <w:bottom w:w="110" w:type="dxa"/>
-          <w:right w:w="110" w:type="dxa"/>
-        </w:tblCellMar>
-      </w:tblPr>
-      <w:tblGrid>
-        <w:gridCol w:w="1191"/>
-        <w:gridCol w:w="1474"/>
-        <w:gridCol w:w="4904"/>
-        <w:gridCol w:w="2069"/>
-      </w:tblGrid>
-      <w:tr>
-        <w:trPr>
-          <w:cantSplit/>
-          <w:tblHeader/>
-        </w:trPr>
-        <w:tc>
-          <w:tcPr>
-            <w:tcW w:type="dxa" w:w="1191"/>
+            <w:tcW w:type="dxa" w:w="2098"/>
             <w:vAlign w:val="center"/>
             <w:shd w:fill="E8EEF3"/>
           </w:tcPr>
@@ -483,13 +98,13 @@
                 <w:color w:val="000000"/>
                 <w:sz w:val="21"/>
               </w:rPr>
-              <w:t>论文环节</w:t>
+              <w:t>工具</w:t>
             </w:r>
           </w:p>
         </w:tc>
         <w:tc>
           <w:tcPr>
-            <w:tcW w:type="dxa" w:w="1474"/>
+            <w:tcW w:type="dxa" w:w="2721"/>
             <w:vAlign w:val="center"/>
             <w:shd w:fill="E8EEF3"/>
           </w:tcPr>
@@ -505,13 +120,13 @@
                 <w:color w:val="000000"/>
                 <w:sz w:val="21"/>
               </w:rPr>
-              <w:t>是否使用</w:t>
+              <w:t>模型名称与版本</w:t>
             </w:r>
           </w:p>
         </w:tc>
         <w:tc>
           <w:tcPr>
-            <w:tcW w:type="dxa" w:w="4904"/>
+            <w:tcW w:type="dxa" w:w="4819"/>
             <w:vAlign w:val="center"/>
             <w:shd w:fill="E8EEF3"/>
           </w:tcPr>
@@ -527,29 +142,7 @@
                 <w:color w:val="000000"/>
                 <w:sz w:val="21"/>
               </w:rPr>
-              <w:t>工具及具体工作</w:t>
-            </w:r>
-          </w:p>
-        </w:tc>
-        <w:tc>
-          <w:tcPr>
-            <w:tcW w:type="dxa" w:w="2069"/>
-            <w:vAlign w:val="center"/>
-            <w:shd w:fill="E8EEF3"/>
-          </w:tcPr>
-          <w:p>
-            <w:pPr>
-              <w:spacing w:line="264" w:lineRule="auto" w:after="0" w:before="0"/>
-              <w:jc w:val="center"/>
-            </w:pPr>
-            <w:r>
-              <w:rPr>
-                <w:rFonts w:ascii="Times New Roman" w:hAnsi="Times New Roman" w:eastAsia="宋体"/>
-                <w:b/>
-                <w:color w:val="000000"/>
-                <w:sz w:val="21"/>
-              </w:rPr>
-              <w:t>记录或采用位置</w:t>
+              <w:t>主要用途</w:t>
             </w:r>
           </w:p>
         </w:tc>
@@ -560,28 +153,7 @@
         </w:trPr>
         <w:tc>
           <w:tcPr>
-            <w:tcW w:type="dxa" w:w="1191"/>
-            <w:vAlign w:val="center"/>
-          </w:tcPr>
-          <w:p>
-            <w:pPr>
-              <w:spacing w:line="264" w:lineRule="auto" w:after="0" w:before="0"/>
-              <w:jc w:val="center"/>
-            </w:pPr>
-            <w:r>
-              <w:rPr>
-                <w:rFonts w:ascii="Times New Roman" w:hAnsi="Times New Roman" w:eastAsia="宋体"/>
-                <w:b w:val="0"/>
-                <w:color w:val="000000"/>
-                <w:sz w:val="21"/>
-              </w:rPr>
-              <w:t>赛题理解</w:t>
-            </w:r>
-          </w:p>
-        </w:tc>
-        <w:tc>
-          <w:tcPr>
-            <w:tcW w:type="dxa" w:w="1474"/>
+            <w:tcW w:type="dxa" w:w="2098"/>
             <w:vAlign w:val="center"/>
           </w:tcPr>
           <w:p>
@@ -595,13 +167,13 @@
                 <w:color w:val="000000"/>
                 <w:sz w:val="21"/>
               </w:rPr>
-              <w:t>已使用</w:t>
+              <w:t>Deepseek Harness</w:t>
             </w:r>
           </w:p>
         </w:tc>
         <w:tc>
           <w:tcPr>
-            <w:tcW w:type="dxa" w:w="4904"/>
+            <w:tcW w:type="dxa" w:w="2721"/>
             <w:vAlign w:val="center"/>
           </w:tcPr>
           <w:p>
@@ -615,13 +187,13 @@
                 <w:color w:val="000000"/>
                 <w:sz w:val="21"/>
               </w:rPr>
-              <w:t>Codex 与 GPT6-Astra：梳理各问研究目标、已知条件、输入数据和输出要求；解释温度、干基含水率、物性参数及半径变化等量的含义和联系。</w:t>
+              <w:t>Deepseek v4.1 flash</w:t>
             </w:r>
           </w:p>
         </w:tc>
         <w:tc>
           <w:tcPr>
-            <w:tcW w:type="dxa" w:w="2069"/>
+            <w:tcW w:type="dxa" w:w="4819"/>
             <w:vAlign w:val="center"/>
           </w:tcPr>
           <w:p>
@@ -635,7 +207,7 @@
                 <w:color w:val="000000"/>
                 <w:sz w:val="21"/>
               </w:rPr>
-              <w:t>待填写对应问题、论文位置或记录编号。</w:t>
+              <w:t>对已编写代码进行语法检查，结合报错信息辅助定位和修改部分程序问题。</w:t>
             </w:r>
           </w:p>
         </w:tc>
@@ -646,28 +218,7 @@
         </w:trPr>
         <w:tc>
           <w:tcPr>
-            <w:tcW w:type="dxa" w:w="1191"/>
-            <w:vAlign w:val="center"/>
-          </w:tcPr>
-          <w:p>
-            <w:pPr>
-              <w:spacing w:line="264" w:lineRule="auto" w:after="0" w:before="0"/>
-              <w:jc w:val="center"/>
-            </w:pPr>
-            <w:r>
-              <w:rPr>
-                <w:rFonts w:ascii="Times New Roman" w:hAnsi="Times New Roman" w:eastAsia="宋体"/>
-                <w:b w:val="0"/>
-                <w:color w:val="000000"/>
-                <w:sz w:val="21"/>
-              </w:rPr>
-              <w:t>模型假设</w:t>
-            </w:r>
-          </w:p>
-        </w:tc>
-        <w:tc>
-          <w:tcPr>
-            <w:tcW w:type="dxa" w:w="1474"/>
+            <w:tcW w:type="dxa" w:w="2098"/>
             <w:vAlign w:val="center"/>
           </w:tcPr>
           <w:p>
@@ -681,13 +232,13 @@
                 <w:color w:val="000000"/>
                 <w:sz w:val="21"/>
               </w:rPr>
-              <w:t>待本队确认</w:t>
+              <w:t>Codex</w:t>
             </w:r>
           </w:p>
         </w:tc>
         <w:tc>
           <w:tcPr>
-            <w:tcW w:type="dxa" w:w="4904"/>
+            <w:tcW w:type="dxa" w:w="2721"/>
             <w:vAlign w:val="center"/>
           </w:tcPr>
           <w:p>
@@ -701,13 +252,13 @@
                 <w:color w:val="000000"/>
                 <w:sz w:val="21"/>
               </w:rPr>
-              <w:t>请核实是否使用 AI 辅助提出或检查假设；如使用，填写工具、假设内容与队伍处理方式。</w:t>
+              <w:t>GPT6-Astra</w:t>
             </w:r>
           </w:p>
         </w:tc>
         <w:tc>
           <w:tcPr>
-            <w:tcW w:type="dxa" w:w="2069"/>
+            <w:tcW w:type="dxa" w:w="4819"/>
             <w:vAlign w:val="center"/>
           </w:tcPr>
           <w:p>
@@ -721,454 +272,24 @@
                 <w:color w:val="000000"/>
                 <w:sz w:val="21"/>
               </w:rPr>
-              <w:t>待填写；如未使用，经确认后注明。</w:t>
-            </w:r>
-          </w:p>
-        </w:tc>
-      </w:tr>
-      <w:tr>
-        <w:trPr>
-          <w:cantSplit/>
-        </w:trPr>
-        <w:tc>
-          <w:tcPr>
-            <w:tcW w:type="dxa" w:w="1191"/>
-            <w:vAlign w:val="center"/>
-          </w:tcPr>
-          <w:p>
-            <w:pPr>
-              <w:spacing w:line="264" w:lineRule="auto" w:after="0" w:before="0"/>
-              <w:jc w:val="center"/>
-            </w:pPr>
-            <w:r>
-              <w:rPr>
-                <w:rFonts w:ascii="Times New Roman" w:hAnsi="Times New Roman" w:eastAsia="宋体"/>
-                <w:b w:val="0"/>
-                <w:color w:val="000000"/>
-                <w:sz w:val="21"/>
-              </w:rPr>
-              <w:t>建模设计</w:t>
-            </w:r>
-          </w:p>
-        </w:tc>
-        <w:tc>
-          <w:tcPr>
-            <w:tcW w:type="dxa" w:w="1474"/>
-            <w:vAlign w:val="center"/>
-          </w:tcPr>
-          <w:p>
-            <w:pPr>
-              <w:spacing w:line="264" w:lineRule="auto" w:after="0" w:before="0"/>
-            </w:pPr>
-            <w:r>
-              <w:rPr>
-                <w:rFonts w:ascii="Times New Roman" w:hAnsi="Times New Roman" w:eastAsia="宋体"/>
-                <w:b w:val="0"/>
-                <w:color w:val="000000"/>
-                <w:sz w:val="21"/>
-              </w:rPr>
-              <w:t>待本队确认</w:t>
-            </w:r>
-          </w:p>
-        </w:tc>
-        <w:tc>
-          <w:tcPr>
-            <w:tcW w:type="dxa" w:w="4904"/>
-            <w:vAlign w:val="center"/>
-          </w:tcPr>
-          <w:p>
-            <w:pPr>
-              <w:spacing w:line="264" w:lineRule="auto" w:after="0" w:before="0"/>
-            </w:pPr>
-            <w:r>
-              <w:rPr>
-                <w:rFonts w:ascii="Times New Roman" w:hAnsi="Times New Roman" w:eastAsia="宋体"/>
-                <w:b w:val="0"/>
-                <w:color w:val="000000"/>
-                <w:sz w:val="21"/>
-              </w:rPr>
-              <w:t>请核实公式整理是否涉及模型设计、模型选择或推导建议；如涉及，填写 AI 的实际作用与本队完成的内容。</w:t>
-            </w:r>
-          </w:p>
-        </w:tc>
-        <w:tc>
-          <w:tcPr>
-            <w:tcW w:type="dxa" w:w="2069"/>
-            <w:vAlign w:val="center"/>
-          </w:tcPr>
-          <w:p>
-            <w:pPr>
-              <w:spacing w:line="264" w:lineRule="auto" w:after="0" w:before="0"/>
-            </w:pPr>
-            <w:r>
-              <w:rPr>
-                <w:rFonts w:ascii="Times New Roman" w:hAnsi="Times New Roman" w:eastAsia="宋体"/>
-                <w:b w:val="0"/>
-                <w:color w:val="000000"/>
-                <w:sz w:val="21"/>
-              </w:rPr>
-              <w:t>待填写；如未使用，经确认后注明。</w:t>
-            </w:r>
-          </w:p>
-        </w:tc>
-      </w:tr>
-      <w:tr>
-        <w:trPr>
-          <w:cantSplit/>
-        </w:trPr>
-        <w:tc>
-          <w:tcPr>
-            <w:tcW w:type="dxa" w:w="1191"/>
-            <w:vAlign w:val="center"/>
-          </w:tcPr>
-          <w:p>
-            <w:pPr>
-              <w:spacing w:line="264" w:lineRule="auto" w:after="0" w:before="0"/>
-              <w:jc w:val="center"/>
-            </w:pPr>
-            <w:r>
-              <w:rPr>
-                <w:rFonts w:ascii="Times New Roman" w:hAnsi="Times New Roman" w:eastAsia="宋体"/>
-                <w:b w:val="0"/>
-                <w:color w:val="000000"/>
-                <w:sz w:val="21"/>
-              </w:rPr>
-              <w:t>代码求解</w:t>
-            </w:r>
-          </w:p>
-        </w:tc>
-        <w:tc>
-          <w:tcPr>
-            <w:tcW w:type="dxa" w:w="1474"/>
-            <w:vAlign w:val="center"/>
-          </w:tcPr>
-          <w:p>
-            <w:pPr>
-              <w:spacing w:line="264" w:lineRule="auto" w:after="0" w:before="0"/>
-            </w:pPr>
-            <w:r>
-              <w:rPr>
-                <w:rFonts w:ascii="Times New Roman" w:hAnsi="Times New Roman" w:eastAsia="宋体"/>
-                <w:b w:val="0"/>
-                <w:color w:val="000000"/>
-                <w:sz w:val="21"/>
-              </w:rPr>
-              <w:t>已使用</w:t>
-            </w:r>
-          </w:p>
-        </w:tc>
-        <w:tc>
-          <w:tcPr>
-            <w:tcW w:type="dxa" w:w="4904"/>
-            <w:vAlign w:val="center"/>
-          </w:tcPr>
-          <w:p>
-            <w:pPr>
-              <w:spacing w:line="264" w:lineRule="auto" w:after="0" w:before="0"/>
-            </w:pPr>
-            <w:r>
-              <w:rPr>
-                <w:rFonts w:ascii="Times New Roman" w:hAnsi="Times New Roman" w:eastAsia="宋体"/>
-                <w:b w:val="0"/>
-                <w:color w:val="000000"/>
-                <w:sz w:val="21"/>
-              </w:rPr>
-              <w:t>Deepseek Harness 与 Deepseek v4.1 flash：检查括号、引号、缩进、语句结构及函数调用；解释报错并梳理变量、参数与函数间的传递关系，辅助部分调试。</w:t>
-            </w:r>
-          </w:p>
-        </w:tc>
-        <w:tc>
-          <w:tcPr>
-            <w:tcW w:type="dxa" w:w="2069"/>
-            <w:vAlign w:val="center"/>
-          </w:tcPr>
-          <w:p>
-            <w:pPr>
-              <w:spacing w:line="264" w:lineRule="auto" w:after="0" w:before="0"/>
-            </w:pPr>
-            <w:r>
-              <w:rPr>
-                <w:rFonts w:ascii="Times New Roman" w:hAnsi="Times New Roman" w:eastAsia="宋体"/>
-                <w:b w:val="0"/>
-                <w:color w:val="000000"/>
-                <w:sz w:val="21"/>
-              </w:rPr>
-              <w:t>待填写源码文件、报错与修改位置，以及记录编号。</w:t>
-            </w:r>
-          </w:p>
-        </w:tc>
-      </w:tr>
-      <w:tr>
-        <w:trPr>
-          <w:cantSplit/>
-        </w:trPr>
-        <w:tc>
-          <w:tcPr>
-            <w:tcW w:type="dxa" w:w="1191"/>
-            <w:vAlign w:val="center"/>
-          </w:tcPr>
-          <w:p>
-            <w:pPr>
-              <w:spacing w:line="264" w:lineRule="auto" w:after="0" w:before="0"/>
-              <w:jc w:val="center"/>
-            </w:pPr>
-            <w:r>
-              <w:rPr>
-                <w:rFonts w:ascii="Times New Roman" w:hAnsi="Times New Roman" w:eastAsia="宋体"/>
-                <w:b w:val="0"/>
-                <w:color w:val="000000"/>
-                <w:sz w:val="21"/>
-              </w:rPr>
-              <w:t>结果检验</w:t>
-            </w:r>
-          </w:p>
-        </w:tc>
-        <w:tc>
-          <w:tcPr>
-            <w:tcW w:type="dxa" w:w="1474"/>
-            <w:vAlign w:val="center"/>
-          </w:tcPr>
-          <w:p>
-            <w:pPr>
-              <w:spacing w:line="264" w:lineRule="auto" w:after="0" w:before="0"/>
-            </w:pPr>
-            <w:r>
-              <w:rPr>
-                <w:rFonts w:ascii="Times New Roman" w:hAnsi="Times New Roman" w:eastAsia="宋体"/>
-                <w:b w:val="0"/>
-                <w:color w:val="000000"/>
-                <w:sz w:val="21"/>
-              </w:rPr>
-              <w:t>已使用</w:t>
-            </w:r>
-          </w:p>
-        </w:tc>
-        <w:tc>
-          <w:tcPr>
-            <w:tcW w:type="dxa" w:w="4904"/>
-            <w:vAlign w:val="center"/>
-          </w:tcPr>
-          <w:p>
-            <w:pPr>
-              <w:spacing w:line="264" w:lineRule="auto" w:after="0" w:before="0"/>
-            </w:pPr>
-            <w:r>
-              <w:rPr>
-                <w:rFonts w:ascii="Times New Roman" w:hAnsi="Times New Roman" w:eastAsia="宋体"/>
-                <w:b w:val="0"/>
-                <w:color w:val="000000"/>
-                <w:sz w:val="21"/>
-              </w:rPr>
-              <w:t>Codex 与 GPT6-Astra：检查数值结果与题设条件、模型方程和边界条件的对应关系；核对温度、含水率和干燥时间的单位、趋势与表达。</w:t>
-            </w:r>
-          </w:p>
-        </w:tc>
-        <w:tc>
-          <w:tcPr>
-            <w:tcW w:type="dxa" w:w="2069"/>
-            <w:vAlign w:val="center"/>
-          </w:tcPr>
-          <w:p>
-            <w:pPr>
-              <w:spacing w:line="264" w:lineRule="auto" w:after="0" w:before="0"/>
-            </w:pPr>
-            <w:r>
-              <w:rPr>
-                <w:rFonts w:ascii="Times New Roman" w:hAnsi="Times New Roman" w:eastAsia="宋体"/>
-                <w:b w:val="0"/>
-                <w:color w:val="000000"/>
-                <w:sz w:val="21"/>
-              </w:rPr>
-              <w:t>待填写结果表、图或检验记录编号。</w:t>
-            </w:r>
-          </w:p>
-        </w:tc>
-      </w:tr>
-      <w:tr>
-        <w:trPr>
-          <w:cantSplit/>
-        </w:trPr>
-        <w:tc>
-          <w:tcPr>
-            <w:tcW w:type="dxa" w:w="1191"/>
-            <w:vAlign w:val="center"/>
-          </w:tcPr>
-          <w:p>
-            <w:pPr>
-              <w:spacing w:line="264" w:lineRule="auto" w:after="0" w:before="0"/>
-              <w:jc w:val="center"/>
-            </w:pPr>
-            <w:r>
-              <w:rPr>
-                <w:rFonts w:ascii="Times New Roman" w:hAnsi="Times New Roman" w:eastAsia="宋体"/>
-                <w:b w:val="0"/>
-                <w:color w:val="000000"/>
-                <w:sz w:val="21"/>
-              </w:rPr>
-              <w:t>论文撰写</w:t>
-            </w:r>
-          </w:p>
-        </w:tc>
-        <w:tc>
-          <w:tcPr>
-            <w:tcW w:type="dxa" w:w="1474"/>
-            <w:vAlign w:val="center"/>
-          </w:tcPr>
-          <w:p>
-            <w:pPr>
-              <w:spacing w:line="264" w:lineRule="auto" w:after="0" w:before="0"/>
-            </w:pPr>
-            <w:r>
-              <w:rPr>
-                <w:rFonts w:ascii="Times New Roman" w:hAnsi="Times New Roman" w:eastAsia="宋体"/>
-                <w:b w:val="0"/>
-                <w:color w:val="000000"/>
-                <w:sz w:val="21"/>
-              </w:rPr>
-              <w:t>已使用</w:t>
-            </w:r>
-          </w:p>
-        </w:tc>
-        <w:tc>
-          <w:tcPr>
-            <w:tcW w:type="dxa" w:w="4904"/>
-            <w:vAlign w:val="center"/>
-          </w:tcPr>
-          <w:p>
-            <w:pPr>
-              <w:spacing w:line="264" w:lineRule="auto" w:after="0" w:before="0"/>
-            </w:pPr>
-            <w:r>
-              <w:rPr>
-                <w:rFonts w:ascii="Times New Roman" w:hAnsi="Times New Roman" w:eastAsia="宋体"/>
-                <w:b w:val="0"/>
-                <w:color w:val="000000"/>
-                <w:sz w:val="21"/>
-              </w:rPr>
-              <w:t>Codex 与 GPT6-Astra：整理公式，梳理推导步骤，统一符号写法，检查公式衔接及其与变量说明的对应关系。</w:t>
-            </w:r>
-          </w:p>
-        </w:tc>
-        <w:tc>
-          <w:tcPr>
-            <w:tcW w:type="dxa" w:w="2069"/>
-            <w:vAlign w:val="center"/>
-          </w:tcPr>
-          <w:p>
-            <w:pPr>
-              <w:spacing w:line="264" w:lineRule="auto" w:after="0" w:before="0"/>
-            </w:pPr>
-            <w:r>
-              <w:rPr>
-                <w:rFonts w:ascii="Times New Roman" w:hAnsi="Times New Roman" w:eastAsia="宋体"/>
-                <w:b w:val="0"/>
-                <w:color w:val="000000"/>
-                <w:sz w:val="21"/>
-              </w:rPr>
-              <w:t>待填写公式或章节位置；其他写作辅助情况待本队确认。</w:t>
-            </w:r>
-          </w:p>
-        </w:tc>
-      </w:tr>
-      <w:tr>
-        <w:trPr>
-          <w:cantSplit/>
-        </w:trPr>
-        <w:tc>
-          <w:tcPr>
-            <w:tcW w:type="dxa" w:w="1191"/>
-            <w:vAlign w:val="center"/>
-          </w:tcPr>
-          <w:p>
-            <w:pPr>
-              <w:spacing w:line="264" w:lineRule="auto" w:after="0" w:before="0"/>
-              <w:jc w:val="center"/>
-            </w:pPr>
-            <w:r>
-              <w:rPr>
-                <w:rFonts w:ascii="Times New Roman" w:hAnsi="Times New Roman" w:eastAsia="宋体"/>
-                <w:b w:val="0"/>
-                <w:color w:val="000000"/>
-                <w:sz w:val="21"/>
-              </w:rPr>
-              <w:t>辅助工作</w:t>
-            </w:r>
-          </w:p>
-        </w:tc>
-        <w:tc>
-          <w:tcPr>
-            <w:tcW w:type="dxa" w:w="1474"/>
-            <w:vAlign w:val="center"/>
-          </w:tcPr>
-          <w:p>
-            <w:pPr>
-              <w:spacing w:line="264" w:lineRule="auto" w:after="0" w:before="0"/>
-            </w:pPr>
-            <w:r>
-              <w:rPr>
-                <w:rFonts w:ascii="Times New Roman" w:hAnsi="Times New Roman" w:eastAsia="宋体"/>
-                <w:b w:val="0"/>
-                <w:color w:val="000000"/>
-                <w:sz w:val="21"/>
-              </w:rPr>
-              <w:t>已使用</w:t>
-            </w:r>
-          </w:p>
-        </w:tc>
-        <w:tc>
-          <w:tcPr>
-            <w:tcW w:type="dxa" w:w="4904"/>
-            <w:vAlign w:val="center"/>
-          </w:tcPr>
-          <w:p>
-            <w:pPr>
-              <w:spacing w:line="264" w:lineRule="auto" w:after="0" w:before="0"/>
-            </w:pPr>
-            <w:r>
-              <w:rPr>
-                <w:rFonts w:ascii="Times New Roman" w:hAnsi="Times New Roman" w:eastAsia="宋体"/>
-                <w:b w:val="0"/>
-                <w:color w:val="000000"/>
-                <w:sz w:val="21"/>
-              </w:rPr>
-              <w:t>Codex 与 GPT6-Astra：围绕药材干燥、热湿耦合传递及相关数值方法检索文献线索和理论资料。</w:t>
-            </w:r>
-          </w:p>
-        </w:tc>
-        <w:tc>
-          <w:tcPr>
-            <w:tcW w:type="dxa" w:w="2069"/>
-            <w:vAlign w:val="center"/>
-          </w:tcPr>
-          <w:p>
-            <w:pPr>
-              <w:spacing w:line="264" w:lineRule="auto" w:after="0" w:before="0"/>
-            </w:pPr>
-            <w:r>
-              <w:rPr>
-                <w:rFonts w:ascii="Times New Roman" w:hAnsi="Times New Roman" w:eastAsia="宋体"/>
-                <w:b w:val="0"/>
-                <w:color w:val="000000"/>
-                <w:sz w:val="21"/>
-              </w:rPr>
-              <w:t>待填写实际查阅文献、采用位置及记录编号。</w:t>
+              <w:t>梳理题意与模型条件；检索文献；检查公式和数值结果；整理绘图程序、数据及论文支撑材料。</w:t>
             </w:r>
           </w:p>
         </w:tc>
       </w:tr>
     </w:tbl>
     <w:p>
-      <w:r>
-        <w:br w:type="page"/>
-      </w:r>
-    </w:p>
-    <w:p>
       <w:pPr>
-        <w:pStyle w:val="Heading1"/>
-        <w:keepNext/>
+        <w:spacing w:after="120"/>
       </w:pPr>
       <w:r>
-        <w:t>三 典型交互记录</w:t>
+        <w:rPr>
+          <w:rFonts w:ascii="Times New Roman" w:hAnsi="Times New Roman" w:eastAsia="宋体"/>
+          <w:b w:val="0"/>
+          <w:color w:val="000000"/>
+          <w:sz w:val="21"/>
+        </w:rPr>
+        <w:t>版本登记采用论文第9.3节记载的模型名称。以下典型交互发生于2026年9月13日，均为Codex中的实际文字交互。</w:t>
       </w:r>
     </w:p>
     <w:p>
@@ -1177,7 +298,7 @@
         <w:keepNext/>
       </w:pPr>
       <w:r>
-        <w:t>记录1 源代码语法检查或程序调试</w:t>
+        <w:t>交互方式</w:t>
       </w:r>
     </w:p>
     <w:p>
@@ -1191,7 +312,35 @@
           <w:color w:val="000000"/>
           <w:sz w:val="21"/>
         </w:rPr>
-        <w:t>请从对应用途的真实交互中选取一例并完整保留原文。截图中的姓名、学校、账号等身份信息按匿名要求处理，保留任务相关内容。</w:t>
+        <w:t>本队通过文字提出任务，并指定论文DOCX、程序、CSV和结果表作为工作对象；AI读取文件、提出检查结论，并按指令修改支撑材料。结果以可编辑文档、源码、数据清单和运行记录交付。</w:t>
+      </w:r>
+    </w:p>
+    <w:p>
+      <w:pPr>
+        <w:spacing w:after="120"/>
+      </w:pPr>
+      <w:r>
+        <w:rPr>
+          <w:rFonts w:ascii="Times New Roman" w:hAnsi="Times New Roman" w:eastAsia="宋体"/>
+          <w:b w:val="0"/>
+          <w:color w:val="000000"/>
+          <w:sz w:val="21"/>
+        </w:rPr>
+        <w:t>以下三例来自同一轮提交前补件交互，按绘图、数值检验和附录整理三个任务分别记录。提示词和AI回复按对应主题摘录，保留原文；处理情况和核验结果依据实际文件与运行记录整理。</w:t>
+      </w:r>
+    </w:p>
+    <w:p>
+      <w:r>
+        <w:br w:type="page"/>
+      </w:r>
+    </w:p>
+    <w:p>
+      <w:pPr>
+        <w:pStyle w:val="Heading1"/>
+        <w:keepNext/>
+      </w:pPr>
+      <w:r>
+        <w:t>二 分环节使用记录</w:t>
       </w:r>
     </w:p>
     <w:tbl>
@@ -1216,16 +365,18 @@
         </w:tblCellMar>
       </w:tblPr>
       <w:tblGrid>
-        <w:gridCol w:w="1814"/>
-        <w:gridCol w:w="7824"/>
+        <w:gridCol w:w="1304"/>
+        <w:gridCol w:w="1134"/>
+        <w:gridCol w:w="7200"/>
       </w:tblGrid>
       <w:tr>
         <w:trPr>
+          <w:cantSplit/>
           <w:tblHeader/>
         </w:trPr>
         <w:tc>
           <w:tcPr>
-            <w:tcW w:type="dxa" w:w="1814"/>
+            <w:tcW w:type="dxa" w:w="1304"/>
             <w:vAlign w:val="center"/>
             <w:shd w:fill="E8EEF3"/>
           </w:tcPr>
@@ -1241,13 +392,13 @@
                 <w:color w:val="000000"/>
                 <w:sz w:val="21"/>
               </w:rPr>
-              <w:t>记录字段</w:t>
+              <w:t>环节</w:t>
             </w:r>
           </w:p>
         </w:tc>
         <w:tc>
           <w:tcPr>
-            <w:tcW w:type="dxa" w:w="7824"/>
+            <w:tcW w:type="dxa" w:w="1134"/>
             <w:vAlign w:val="center"/>
             <w:shd w:fill="E8EEF3"/>
           </w:tcPr>
@@ -1263,16 +414,61 @@
                 <w:color w:val="000000"/>
                 <w:sz w:val="21"/>
               </w:rPr>
-              <w:t>填写内容</w:t>
+              <w:t>使用情况</w:t>
+            </w:r>
+          </w:p>
+        </w:tc>
+        <w:tc>
+          <w:tcPr>
+            <w:tcW w:type="dxa" w:w="7200"/>
+            <w:vAlign w:val="center"/>
+            <w:shd w:fill="E8EEF3"/>
+          </w:tcPr>
+          <w:p>
+            <w:pPr>
+              <w:spacing w:line="264" w:lineRule="auto" w:after="0" w:before="0"/>
+              <w:jc w:val="center"/>
+            </w:pPr>
+            <w:r>
+              <w:rPr>
+                <w:rFonts w:ascii="Times New Roman" w:hAnsi="Times New Roman" w:eastAsia="宋体"/>
+                <w:b/>
+                <w:color w:val="000000"/>
+                <w:sz w:val="21"/>
+              </w:rPr>
+              <w:t>具体工作与采用位置</w:t>
             </w:r>
           </w:p>
         </w:tc>
       </w:tr>
       <w:tr>
-        <w:trPr/>
+        <w:trPr>
+          <w:cantSplit/>
+        </w:trPr>
         <w:tc>
           <w:tcPr>
-            <w:tcW w:type="dxa" w:w="1814"/>
+            <w:tcW w:type="dxa" w:w="1304"/>
+            <w:vAlign w:val="center"/>
+          </w:tcPr>
+          <w:p>
+            <w:pPr>
+              <w:spacing w:line="264" w:lineRule="auto" w:after="0" w:before="0"/>
+              <w:jc w:val="center"/>
+            </w:pPr>
+            <w:r>
+              <w:rPr>
+                <w:rFonts w:ascii="Times New Roman" w:hAnsi="Times New Roman" w:eastAsia="宋体"/>
+                <w:b w:val="0"/>
+                <w:color w:val="000000"/>
+                <w:sz w:val="21"/>
+              </w:rPr>
+              <w:t>赛题理解</w:t>
+            </w:r>
+          </w:p>
+        </w:tc>
+        <w:tc>
+          <w:tcPr>
+            <w:tcW w:type="dxa" w:w="1134"/>
             <w:vAlign w:val="center"/>
           </w:tcPr>
           <w:p>
@@ -1286,13 +482,13 @@
                 <w:color w:val="000000"/>
                 <w:sz w:val="21"/>
               </w:rPr>
-              <w:t>工具及环节</w:t>
+              <w:t>使用</w:t>
             </w:r>
           </w:p>
         </w:tc>
         <w:tc>
           <w:tcPr>
-            <w:tcW w:type="dxa" w:w="7824"/>
+            <w:tcW w:type="dxa" w:w="7200"/>
             <w:vAlign w:val="center"/>
           </w:tcPr>
           <w:p>
@@ -1306,11 +502,25 @@
                 <w:color w:val="000000"/>
                 <w:sz w:val="21"/>
               </w:rPr>
-              <w:t>工具：Deepseek Harness 与 Deepseek v4.1 flash</w:t>
+              <w:t>Codex辅助梳理四问的输入、输出和递进关系，区分附件1环境观测、附件2半径变化与附件3结果模板。采用位置：问题分析、符号说明和各问模型；支撑01。</w:t>
             </w:r>
-            <w:r>
-              <w:br/>
-            </w:r>
+          </w:p>
+        </w:tc>
+      </w:tr>
+      <w:tr>
+        <w:trPr>
+          <w:cantSplit/>
+        </w:trPr>
+        <w:tc>
+          <w:tcPr>
+            <w:tcW w:type="dxa" w:w="1304"/>
+            <w:vAlign w:val="center"/>
+          </w:tcPr>
+          <w:p>
+            <w:pPr>
+              <w:spacing w:line="264" w:lineRule="auto" w:after="0" w:before="0"/>
+              <w:jc w:val="center"/>
+            </w:pPr>
             <w:r>
               <w:rPr>
                 <w:rFonts w:ascii="Times New Roman" w:hAnsi="Times New Roman" w:eastAsia="宋体"/>
@@ -1318,16 +528,13 @@
                 <w:color w:val="000000"/>
                 <w:sz w:val="21"/>
               </w:rPr>
-              <w:t>环节：代码求解；实际日期与时间：待填写</w:t>
+              <w:t>模型假设</w:t>
             </w:r>
           </w:p>
         </w:tc>
-      </w:tr>
-      <w:tr>
-        <w:trPr/>
         <w:tc>
           <w:tcPr>
-            <w:tcW w:type="dxa" w:w="1814"/>
+            <w:tcW w:type="dxa" w:w="1134"/>
             <w:vAlign w:val="center"/>
           </w:tcPr>
           <w:p>
@@ -1341,13 +548,13 @@
                 <w:color w:val="000000"/>
                 <w:sz w:val="21"/>
               </w:rPr>
-              <w:t>具体任务及材料</w:t>
+              <w:t>使用</w:t>
             </w:r>
           </w:p>
         </w:tc>
         <w:tc>
           <w:tcPr>
-            <w:tcW w:type="dxa" w:w="7824"/>
+            <w:tcW w:type="dxa" w:w="7200"/>
             <w:vAlign w:val="center"/>
           </w:tcPr>
           <w:p>
@@ -1361,11 +568,25 @@
                 <w:color w:val="000000"/>
                 <w:sz w:val="21"/>
               </w:rPr>
-              <w:t>待填写实际问题、输入文件或代码片段，以及本次交互需要解决的事项。</w:t>
+              <w:t>Codex辅助检查4小时后的环境平台假设、空气湿度向平衡含水率的映射、同比收缩与固定长度等闭合条件，说明预测结果依赖这些假设。采用位置：模型假设、模型评价。</w:t>
             </w:r>
-            <w:r>
-              <w:br/>
-            </w:r>
+          </w:p>
+        </w:tc>
+      </w:tr>
+      <w:tr>
+        <w:trPr>
+          <w:cantSplit/>
+        </w:trPr>
+        <w:tc>
+          <w:tcPr>
+            <w:tcW w:type="dxa" w:w="1304"/>
+            <w:vAlign w:val="center"/>
+          </w:tcPr>
+          <w:p>
+            <w:pPr>
+              <w:spacing w:line="264" w:lineRule="auto" w:after="0" w:before="0"/>
+              <w:jc w:val="center"/>
+            </w:pPr>
             <w:r>
               <w:rPr>
                 <w:rFonts w:ascii="Times New Roman" w:hAnsi="Times New Roman" w:eastAsia="宋体"/>
@@ -1373,15 +594,13 @@
                 <w:color w:val="000000"/>
                 <w:sz w:val="21"/>
               </w:rPr>
+              <w:t>建模设计</w:t>
             </w:r>
           </w:p>
         </w:tc>
-      </w:tr>
-      <w:tr>
-        <w:trPr/>
         <w:tc>
           <w:tcPr>
-            <w:tcW w:type="dxa" w:w="1814"/>
+            <w:tcW w:type="dxa" w:w="1134"/>
             <w:vAlign w:val="center"/>
           </w:tcPr>
           <w:p>
@@ -1395,13 +614,13 @@
                 <w:color w:val="000000"/>
                 <w:sz w:val="21"/>
               </w:rPr>
-              <w:t>完整提示词</w:t>
+              <w:t>使用</w:t>
             </w:r>
           </w:p>
         </w:tc>
         <w:tc>
           <w:tcPr>
-            <w:tcW w:type="dxa" w:w="7824"/>
+            <w:tcW w:type="dxa" w:w="7200"/>
             <w:vAlign w:val="center"/>
           </w:tcPr>
           <w:p>
@@ -1415,11 +634,25 @@
                 <w:color w:val="000000"/>
                 <w:sz w:val="21"/>
               </w:rPr>
-              <w:t>待粘贴真实提示词全文，或插入完整且清晰的截图。</w:t>
+              <w:t>Codex辅助整理热湿耦合方程、边界条件、Kirchhoff水通量离散及各问模型的联系，检查符号和量纲。采用位置：模型建立与算法说明；03中的dryingCore.py和q1Model.py至q4Model.py。</w:t>
             </w:r>
-            <w:r>
-              <w:br/>
-            </w:r>
+          </w:p>
+        </w:tc>
+      </w:tr>
+      <w:tr>
+        <w:trPr>
+          <w:cantSplit/>
+        </w:trPr>
+        <w:tc>
+          <w:tcPr>
+            <w:tcW w:type="dxa" w:w="1304"/>
+            <w:vAlign w:val="center"/>
+          </w:tcPr>
+          <w:p>
+            <w:pPr>
+              <w:spacing w:line="264" w:lineRule="auto" w:after="0" w:before="0"/>
+              <w:jc w:val="center"/>
+            </w:pPr>
             <w:r>
               <w:rPr>
                 <w:rFonts w:ascii="Times New Roman" w:hAnsi="Times New Roman" w:eastAsia="宋体"/>
@@ -1427,37 +660,13 @@
                 <w:color w:val="000000"/>
                 <w:sz w:val="21"/>
               </w:rPr>
-            </w:r>
-            <w:r>
-              <w:br/>
-            </w:r>
-            <w:r>
-              <w:rPr>
-                <w:rFonts w:ascii="Times New Roman" w:hAnsi="Times New Roman" w:eastAsia="宋体"/>
-                <w:b w:val="0"/>
-                <w:color w:val="000000"/>
-                <w:sz w:val="21"/>
-              </w:rPr>
-            </w:r>
-            <w:r>
-              <w:br/>
-            </w:r>
-            <w:r>
-              <w:rPr>
-                <w:rFonts w:ascii="Times New Roman" w:hAnsi="Times New Roman" w:eastAsia="宋体"/>
-                <w:b w:val="0"/>
-                <w:color w:val="000000"/>
-                <w:sz w:val="21"/>
-              </w:rPr>
+              <w:t>代码求解</w:t>
             </w:r>
           </w:p>
         </w:tc>
-      </w:tr>
-      <w:tr>
-        <w:trPr/>
         <w:tc>
           <w:tcPr>
-            <w:tcW w:type="dxa" w:w="1814"/>
+            <w:tcW w:type="dxa" w:w="1134"/>
             <w:vAlign w:val="center"/>
           </w:tcPr>
           <w:p>
@@ -1471,13 +680,13 @@
                 <w:color w:val="000000"/>
                 <w:sz w:val="21"/>
               </w:rPr>
-              <w:t>AI回复全文</w:t>
+              <w:t>使用</w:t>
             </w:r>
           </w:p>
         </w:tc>
         <w:tc>
           <w:tcPr>
-            <w:tcW w:type="dxa" w:w="7824"/>
+            <w:tcW w:type="dxa" w:w="7200"/>
             <w:vAlign w:val="center"/>
           </w:tcPr>
           <w:p>
@@ -1491,11 +700,25 @@
                 <w:color w:val="000000"/>
                 <w:sz w:val="21"/>
               </w:rPr>
-              <w:t>待粘贴真实 AI 回复全文，或插入完整且清晰的截图。内容较长可续页并标明位置。</w:t>
+              <w:t>Deepseek Harness辅助语法检查和部分调试；Codex辅助程序实现、路径与依赖整理、运行入口和复现检查。本次为method_comparison.py修正一行ROOT定位，并补run_checks.py及依赖清单。采用位置：03、05；实例2。</w:t>
             </w:r>
-            <w:r>
-              <w:br/>
-            </w:r>
+          </w:p>
+        </w:tc>
+      </w:tr>
+      <w:tr>
+        <w:trPr>
+          <w:cantSplit/>
+        </w:trPr>
+        <w:tc>
+          <w:tcPr>
+            <w:tcW w:type="dxa" w:w="1304"/>
+            <w:vAlign w:val="center"/>
+          </w:tcPr>
+          <w:p>
+            <w:pPr>
+              <w:spacing w:line="264" w:lineRule="auto" w:after="0" w:before="0"/>
+              <w:jc w:val="center"/>
+            </w:pPr>
             <w:r>
               <w:rPr>
                 <w:rFonts w:ascii="Times New Roman" w:hAnsi="Times New Roman" w:eastAsia="宋体"/>
@@ -1503,48 +726,13 @@
                 <w:color w:val="000000"/>
                 <w:sz w:val="21"/>
               </w:rPr>
-            </w:r>
-            <w:r>
-              <w:br/>
-            </w:r>
-            <w:r>
-              <w:rPr>
-                <w:rFonts w:ascii="Times New Roman" w:hAnsi="Times New Roman" w:eastAsia="宋体"/>
-                <w:b w:val="0"/>
-                <w:color w:val="000000"/>
-                <w:sz w:val="21"/>
-              </w:rPr>
-            </w:r>
-            <w:r>
-              <w:br/>
-            </w:r>
-            <w:r>
-              <w:rPr>
-                <w:rFonts w:ascii="Times New Roman" w:hAnsi="Times New Roman" w:eastAsia="宋体"/>
-                <w:b w:val="0"/>
-                <w:color w:val="000000"/>
-                <w:sz w:val="21"/>
-              </w:rPr>
-            </w:r>
-            <w:r>
-              <w:br/>
-            </w:r>
-            <w:r>
-              <w:rPr>
-                <w:rFonts w:ascii="Times New Roman" w:hAnsi="Times New Roman" w:eastAsia="宋体"/>
-                <w:b w:val="0"/>
-                <w:color w:val="000000"/>
-                <w:sz w:val="21"/>
-              </w:rPr>
+              <w:t>结果检验</w:t>
             </w:r>
           </w:p>
         </w:tc>
-      </w:tr>
-      <w:tr>
-        <w:trPr/>
         <w:tc>
           <w:tcPr>
-            <w:tcW w:type="dxa" w:w="1814"/>
+            <w:tcW w:type="dxa" w:w="1134"/>
             <w:vAlign w:val="center"/>
           </w:tcPr>
           <w:p>
@@ -1558,13 +746,13 @@
                 <w:color w:val="000000"/>
                 <w:sz w:val="21"/>
               </w:rPr>
-              <w:t>队伍处理方式</w:t>
+              <w:t>使用</w:t>
             </w:r>
           </w:p>
         </w:tc>
         <w:tc>
           <w:tcPr>
-            <w:tcW w:type="dxa" w:w="7824"/>
+            <w:tcW w:type="dxa" w:w="7200"/>
             <w:vAlign w:val="center"/>
           </w:tcPr>
           <w:p>
@@ -1578,11 +766,25 @@
                 <w:color w:val="000000"/>
                 <w:sz w:val="21"/>
               </w:rPr>
-              <w:t>待填写：采纳、修改后采纳、未采纳或仅作参考；说明具体修改及理由，并标明最终采用位置。</w:t>
+              <w:t>Codex辅助核对冻结结果与论文表格，检查网格收敛、时间误差和方法对照。本次实际运行适量检验并读取内部数值报告。采用位置：04、05；实例2。</w:t>
             </w:r>
-            <w:r>
-              <w:br/>
-            </w:r>
+          </w:p>
+        </w:tc>
+      </w:tr>
+      <w:tr>
+        <w:trPr>
+          <w:cantSplit/>
+        </w:trPr>
+        <w:tc>
+          <w:tcPr>
+            <w:tcW w:type="dxa" w:w="1304"/>
+            <w:vAlign w:val="center"/>
+          </w:tcPr>
+          <w:p>
+            <w:pPr>
+              <w:spacing w:line="264" w:lineRule="auto" w:after="0" w:before="0"/>
+              <w:jc w:val="center"/>
+            </w:pPr>
             <w:r>
               <w:rPr>
                 <w:rFonts w:ascii="Times New Roman" w:hAnsi="Times New Roman" w:eastAsia="宋体"/>
@@ -1590,15 +792,13 @@
                 <w:color w:val="000000"/>
                 <w:sz w:val="21"/>
               </w:rPr>
+              <w:t>论文撰写</w:t>
             </w:r>
           </w:p>
         </w:tc>
-      </w:tr>
-      <w:tr>
-        <w:trPr/>
         <w:tc>
           <w:tcPr>
-            <w:tcW w:type="dxa" w:w="1814"/>
+            <w:tcW w:type="dxa" w:w="1134"/>
             <w:vAlign w:val="center"/>
           </w:tcPr>
           <w:p>
@@ -1612,13 +812,13 @@
                 <w:color w:val="000000"/>
                 <w:sz w:val="21"/>
               </w:rPr>
-              <w:t>人工核验过程与结果</w:t>
+              <w:t>使用</w:t>
             </w:r>
           </w:p>
         </w:tc>
         <w:tc>
           <w:tcPr>
-            <w:tcW w:type="dxa" w:w="7824"/>
+            <w:tcW w:type="dxa" w:w="7200"/>
             <w:vAlign w:val="center"/>
           </w:tcPr>
           <w:p>
@@ -1632,11 +832,25 @@
                 <w:color w:val="000000"/>
                 <w:sz w:val="21"/>
               </w:rPr>
-              <w:t>待填写实际采用的核验方法、核验内容和结论，并给出相应计算、运行、原文核对或其他记录的位置。</w:t>
+              <w:t>Codex辅助整理公式与符号、检查正文和结果的一致性，编写支撑文件说明、AI使用记录和附录清单。采用位置：论文第9.3节、AI工具使用详情、附录文件列表；实例3。</w:t>
             </w:r>
-            <w:r>
-              <w:br/>
-            </w:r>
+          </w:p>
+        </w:tc>
+      </w:tr>
+      <w:tr>
+        <w:trPr>
+          <w:cantSplit/>
+        </w:trPr>
+        <w:tc>
+          <w:tcPr>
+            <w:tcW w:type="dxa" w:w="1304"/>
+            <w:vAlign w:val="center"/>
+          </w:tcPr>
+          <w:p>
+            <w:pPr>
+              <w:spacing w:line="264" w:lineRule="auto" w:after="0" w:before="0"/>
+              <w:jc w:val="center"/>
+            </w:pPr>
             <w:r>
               <w:rPr>
                 <w:rFonts w:ascii="Times New Roman" w:hAnsi="Times New Roman" w:eastAsia="宋体"/>
@@ -1644,15 +858,13 @@
                 <w:color w:val="000000"/>
                 <w:sz w:val="21"/>
               </w:rPr>
+              <w:t>辅助工作</w:t>
             </w:r>
           </w:p>
         </w:tc>
-      </w:tr>
-      <w:tr>
-        <w:trPr/>
         <w:tc>
           <w:tcPr>
-            <w:tcW w:type="dxa" w:w="1814"/>
+            <w:tcW w:type="dxa" w:w="1134"/>
             <w:vAlign w:val="center"/>
           </w:tcPr>
           <w:p>
@@ -1666,13 +878,13 @@
                 <w:color w:val="000000"/>
                 <w:sz w:val="21"/>
               </w:rPr>
-              <w:t>记录核对</w:t>
+              <w:t>使用</w:t>
             </w:r>
           </w:p>
         </w:tc>
         <w:tc>
           <w:tcPr>
-            <w:tcW w:type="dxa" w:w="7824"/>
+            <w:tcW w:type="dxa" w:w="7200"/>
             <w:vAlign w:val="center"/>
           </w:tcPr>
           <w:p>
@@ -1686,19 +898,7 @@
                 <w:color w:val="000000"/>
                 <w:sz w:val="21"/>
               </w:rPr>
-              <w:t>核对状态：□ 已核对  □ 待核对</w:t>
-            </w:r>
-            <w:r>
-              <w:br/>
-            </w:r>
-            <w:r>
-              <w:rPr>
-                <w:rFonts w:ascii="Times New Roman" w:hAnsi="Times New Roman" w:eastAsia="宋体"/>
-                <w:b w:val="0"/>
-                <w:color w:val="000000"/>
-                <w:sz w:val="21"/>
-              </w:rPr>
-              <w:t>核对日期：待填写；记录编号或续页位置：待填写</w:t>
+              <w:t>Codex辅助文献检索、文件来源与校验值整理、绘图脚本适配、CSV及PNG归档。采用位置：02、06；实例1。</w:t>
             </w:r>
           </w:p>
         </w:tc>
@@ -1715,7 +915,7 @@
         <w:keepNext/>
       </w:pPr>
       <w:r>
-        <w:t>三 典型交互记录续表</w:t>
+        <w:t>三 典型交互实例</w:t>
       </w:r>
     </w:p>
     <w:p>
@@ -1724,21 +924,7 @@
         <w:keepNext/>
       </w:pPr>
       <w:r>
-        <w:t>记录2 题意理解或参考文献检索</w:t>
-      </w:r>
-    </w:p>
-    <w:p>
-      <w:pPr>
-        <w:spacing w:after="120"/>
-      </w:pPr>
-      <w:r>
-        <w:rPr>
-          <w:rFonts w:ascii="Times New Roman" w:hAnsi="Times New Roman" w:eastAsia="宋体"/>
-          <w:b w:val="0"/>
-          <w:color w:val="000000"/>
-          <w:sz w:val="21"/>
-        </w:rPr>
-        <w:t>请从对应用途的真实交互中选取一例并完整保留原文。截图中的姓名、学校、账号等身份信息按匿名要求处理，保留任务相关内容。</w:t>
+        <w:t>实例1 绘图程序与数据补件</w:t>
       </w:r>
     </w:p>
     <w:tbl>
@@ -1756,23 +942,24 @@
           <w:insideV w:val="single" w:sz="6" w:color="D9D9D9"/>
         </w:tblBorders>
         <w:tblCellMar>
-          <w:top w:w="100" w:type="dxa"/>
-          <w:left w:w="100" w:type="dxa"/>
-          <w:bottom w:w="100" w:type="dxa"/>
-          <w:right w:w="100" w:type="dxa"/>
+          <w:top w:w="130" w:type="dxa"/>
+          <w:left w:w="130" w:type="dxa"/>
+          <w:bottom w:w="130" w:type="dxa"/>
+          <w:right w:w="130" w:type="dxa"/>
         </w:tblCellMar>
       </w:tblPr>
       <w:tblGrid>
-        <w:gridCol w:w="1814"/>
-        <w:gridCol w:w="7824"/>
+        <w:gridCol w:w="1701"/>
+        <w:gridCol w:w="7937"/>
       </w:tblGrid>
       <w:tr>
         <w:trPr>
+          <w:cantSplit/>
           <w:tblHeader/>
         </w:trPr>
         <w:tc>
           <w:tcPr>
-            <w:tcW w:type="dxa" w:w="1814"/>
+            <w:tcW w:type="dxa" w:w="1701"/>
             <w:vAlign w:val="center"/>
             <w:shd w:fill="E8EEF3"/>
           </w:tcPr>
@@ -1788,13 +975,13 @@
                 <w:color w:val="000000"/>
                 <w:sz w:val="21"/>
               </w:rPr>
-              <w:t>记录字段</w:t>
+              <w:t>记录项</w:t>
             </w:r>
           </w:p>
         </w:tc>
         <w:tc>
           <w:tcPr>
-            <w:tcW w:type="dxa" w:w="7824"/>
+            <w:tcW w:type="dxa" w:w="7937"/>
             <w:vAlign w:val="center"/>
             <w:shd w:fill="E8EEF3"/>
           </w:tcPr>
@@ -1810,16 +997,18 @@
                 <w:color w:val="000000"/>
                 <w:sz w:val="21"/>
               </w:rPr>
-              <w:t>填写内容</w:t>
+              <w:t>实际内容</w:t>
             </w:r>
           </w:p>
         </w:tc>
       </w:tr>
       <w:tr>
-        <w:trPr/>
+        <w:trPr>
+          <w:cantSplit/>
+        </w:trPr>
         <w:tc>
           <w:tcPr>
-            <w:tcW w:type="dxa" w:w="1814"/>
+            <w:tcW w:type="dxa" w:w="1701"/>
             <w:vAlign w:val="center"/>
           </w:tcPr>
           <w:p>
@@ -1833,13 +1022,13 @@
                 <w:color w:val="000000"/>
                 <w:sz w:val="21"/>
               </w:rPr>
-              <w:t>工具及环节</w:t>
+              <w:t>工具与时间</w:t>
             </w:r>
           </w:p>
         </w:tc>
         <w:tc>
           <w:tcPr>
-            <w:tcW w:type="dxa" w:w="7824"/>
+            <w:tcW w:type="dxa" w:w="7937"/>
             <w:vAlign w:val="center"/>
           </w:tcPr>
           <w:p>
@@ -1853,28 +1042,18 @@
                 <w:color w:val="000000"/>
                 <w:sz w:val="21"/>
               </w:rPr>
-              <w:t>工具：Codex 与 GPT6-Astra</w:t>
-            </w:r>
-            <w:r>
-              <w:br/>
-            </w:r>
-            <w:r>
-              <w:rPr>
-                <w:rFonts w:ascii="Times New Roman" w:hAnsi="Times New Roman" w:eastAsia="宋体"/>
-                <w:b w:val="0"/>
-                <w:color w:val="000000"/>
-                <w:sz w:val="21"/>
-              </w:rPr>
-              <w:t>环节：赛题理解或辅助工作；实际日期与时间：待填写</w:t>
+              <w:t>Codex 与 GPT6-Astra；2026年9月13日；代码求解与辅助工作。</w:t>
             </w:r>
           </w:p>
         </w:tc>
       </w:tr>
       <w:tr>
-        <w:trPr/>
+        <w:trPr>
+          <w:cantSplit/>
+        </w:trPr>
         <w:tc>
           <w:tcPr>
-            <w:tcW w:type="dxa" w:w="1814"/>
+            <w:tcW w:type="dxa" w:w="1701"/>
             <w:vAlign w:val="center"/>
           </w:tcPr>
           <w:p>
@@ -1888,13 +1067,13 @@
                 <w:color w:val="000000"/>
                 <w:sz w:val="21"/>
               </w:rPr>
-              <w:t>具体任务及材料</w:t>
+              <w:t>提示词节选</w:t>
             </w:r>
           </w:p>
         </w:tc>
         <w:tc>
           <w:tcPr>
-            <w:tcW w:type="dxa" w:w="7824"/>
+            <w:tcW w:type="dxa" w:w="7937"/>
             <w:vAlign w:val="center"/>
           </w:tcPr>
           <w:p>
@@ -1908,27 +1087,18 @@
                 <w:color w:val="000000"/>
                 <w:sz w:val="21"/>
               </w:rPr>
-              <w:t>待填写实际问题、输入文件或代码片段，以及本次交互需要解决的事项。</w:t>
-            </w:r>
-            <w:r>
-              <w:br/>
-            </w:r>
-            <w:r>
-              <w:rPr>
-                <w:rFonts w:ascii="Times New Roman" w:hAnsi="Times New Roman" w:eastAsia="宋体"/>
-                <w:b w:val="0"/>
-                <w:color w:val="000000"/>
-                <w:sz w:val="21"/>
-              </w:rPr>
+              <w:t>2\. 把绘图程序和CSV加进去，留下PNG格式即可</w:t>
             </w:r>
           </w:p>
         </w:tc>
       </w:tr>
       <w:tr>
-        <w:trPr/>
+        <w:trPr>
+          <w:cantSplit/>
+        </w:trPr>
         <w:tc>
           <w:tcPr>
-            <w:tcW w:type="dxa" w:w="1814"/>
+            <w:tcW w:type="dxa" w:w="1701"/>
             <w:vAlign w:val="center"/>
           </w:tcPr>
           <w:p>
@@ -1942,13 +1112,13 @@
                 <w:color w:val="000000"/>
                 <w:sz w:val="21"/>
               </w:rPr>
-              <w:t>完整提示词</w:t>
+              <w:t>AI回复节选</w:t>
             </w:r>
           </w:p>
         </w:tc>
         <w:tc>
           <w:tcPr>
-            <w:tcW w:type="dxa" w:w="7824"/>
+            <w:tcW w:type="dxa" w:w="7937"/>
             <w:vAlign w:val="center"/>
           </w:tcPr>
           <w:p>
@@ -1962,49 +1132,18 @@
                 <w:color w:val="000000"/>
                 <w:sz w:val="21"/>
               </w:rPr>
-              <w:t>待粘贴真实提示词全文，或插入完整且清晰的截图。</w:t>
-            </w:r>
-            <w:r>
-              <w:br/>
-            </w:r>
-            <w:r>
-              <w:rPr>
-                <w:rFonts w:ascii="Times New Roman" w:hAnsi="Times New Roman" w:eastAsia="宋体"/>
-                <w:b w:val="0"/>
-                <w:color w:val="000000"/>
-                <w:sz w:val="21"/>
-              </w:rPr>
-            </w:r>
-            <w:r>
-              <w:br/>
-            </w:r>
-            <w:r>
-              <w:rPr>
-                <w:rFonts w:ascii="Times New Roman" w:hAnsi="Times New Roman" w:eastAsia="宋体"/>
-                <w:b w:val="0"/>
-                <w:color w:val="000000"/>
-                <w:sz w:val="21"/>
-              </w:rPr>
-            </w:r>
-            <w:r>
-              <w:br/>
-            </w:r>
-            <w:r>
-              <w:rPr>
-                <w:rFonts w:ascii="Times New Roman" w:hAnsi="Times New Roman" w:eastAsia="宋体"/>
-                <w:b w:val="0"/>
-                <w:color w:val="000000"/>
-                <w:sz w:val="21"/>
-              </w:rPr>
+              <w:t>绘图程序和数据已加入 `支撑材料/06_绘图程序与数据`：R 程序、14 份 CSV、6 张 PNG及说明、校验文件。图像仅保留 PNG，R 程序已在独立目录实际运行通过。</w:t>
             </w:r>
           </w:p>
         </w:tc>
       </w:tr>
       <w:tr>
-        <w:trPr/>
+        <w:trPr>
+          <w:cantSplit/>
+        </w:trPr>
         <w:tc>
           <w:tcPr>
-            <w:tcW w:type="dxa" w:w="1814"/>
+            <w:tcW w:type="dxa" w:w="1701"/>
             <w:vAlign w:val="center"/>
           </w:tcPr>
           <w:p>
@@ -2018,13 +1157,13 @@
                 <w:color w:val="000000"/>
                 <w:sz w:val="21"/>
               </w:rPr>
-              <w:t>AI回复全文</w:t>
+              <w:t>队伍处理与落地</w:t>
             </w:r>
           </w:p>
         </w:tc>
         <w:tc>
           <w:tcPr>
-            <w:tcW w:type="dxa" w:w="7824"/>
+            <w:tcW w:type="dxa" w:w="7937"/>
             <w:vAlign w:val="center"/>
           </w:tcPr>
           <w:p>
@@ -2038,60 +1177,18 @@
                 <w:color w:val="000000"/>
                 <w:sz w:val="21"/>
               </w:rPr>
-              <w:t>待粘贴真实 AI 回复全文，或插入完整且清晰的截图。内容较长可续页并标明位置。</w:t>
-            </w:r>
-            <w:r>
-              <w:br/>
-            </w:r>
-            <w:r>
-              <w:rPr>
-                <w:rFonts w:ascii="Times New Roman" w:hAnsi="Times New Roman" w:eastAsia="宋体"/>
-                <w:b w:val="0"/>
-                <w:color w:val="000000"/>
-                <w:sz w:val="21"/>
-              </w:rPr>
-            </w:r>
-            <w:r>
-              <w:br/>
-            </w:r>
-            <w:r>
-              <w:rPr>
-                <w:rFonts w:ascii="Times New Roman" w:hAnsi="Times New Roman" w:eastAsia="宋体"/>
-                <w:b w:val="0"/>
-                <w:color w:val="000000"/>
-                <w:sz w:val="21"/>
-              </w:rPr>
-            </w:r>
-            <w:r>
-              <w:br/>
-            </w:r>
-            <w:r>
-              <w:rPr>
-                <w:rFonts w:ascii="Times New Roman" w:hAnsi="Times New Roman" w:eastAsia="宋体"/>
-                <w:b w:val="0"/>
-                <w:color w:val="000000"/>
-                <w:sz w:val="21"/>
-              </w:rPr>
-            </w:r>
-            <w:r>
-              <w:br/>
-            </w:r>
-            <w:r>
-              <w:rPr>
-                <w:rFonts w:ascii="Times New Roman" w:hAnsi="Times New Roman" w:eastAsia="宋体"/>
-                <w:b w:val="0"/>
-                <w:color w:val="000000"/>
-                <w:sz w:val="21"/>
-              </w:rPr>
+              <w:t>将原论文六图对应的R程序和输入CSV加入支撑06。脚本按自身位置定位CSV，图像输出保留PNG，并提供可指定的输出目录；交付保留原论文PNG。</w:t>
             </w:r>
           </w:p>
         </w:tc>
       </w:tr>
       <w:tr>
-        <w:trPr/>
+        <w:trPr>
+          <w:cantSplit/>
+        </w:trPr>
         <w:tc>
           <w:tcPr>
-            <w:tcW w:type="dxa" w:w="1814"/>
+            <w:tcW w:type="dxa" w:w="1701"/>
             <w:vAlign w:val="center"/>
           </w:tcPr>
           <w:p>
@@ -2105,13 +1202,13 @@
                 <w:color w:val="000000"/>
                 <w:sz w:val="21"/>
               </w:rPr>
-              <w:t>队伍处理方式</w:t>
+              <w:t>核验方式与结果</w:t>
             </w:r>
           </w:p>
         </w:tc>
         <w:tc>
           <w:tcPr>
-            <w:tcW w:type="dxa" w:w="7824"/>
+            <w:tcW w:type="dxa" w:w="7937"/>
             <w:vAlign w:val="center"/>
           </w:tcPr>
           <w:p>
@@ -2125,27 +1222,18 @@
                 <w:color w:val="000000"/>
                 <w:sz w:val="21"/>
               </w:rPr>
-              <w:t>待填写：采纳、修改后采纳、未采纳或仅作参考；说明具体修改及理由，并标明最终采用位置。</w:t>
-            </w:r>
-            <w:r>
-              <w:br/>
-            </w:r>
-            <w:r>
-              <w:rPr>
-                <w:rFonts w:ascii="Times New Roman" w:hAnsi="Times New Roman" w:eastAsia="宋体"/>
-                <w:b w:val="0"/>
-                <w:color w:val="000000"/>
-                <w:sz w:val="21"/>
-              </w:rPr>
+              <w:t>14份CSV共4627行数据及6张PNG与原图目录逐字节一致。R程序在独立目录实际退出0。当前环境重绘与历史PNG有少量像素差异；原程序与适配程序在同一当前环境重绘结果一致。</w:t>
             </w:r>
           </w:p>
         </w:tc>
       </w:tr>
       <w:tr>
-        <w:trPr/>
+        <w:trPr>
+          <w:cantSplit/>
+        </w:trPr>
         <w:tc>
           <w:tcPr>
-            <w:tcW w:type="dxa" w:w="1814"/>
+            <w:tcW w:type="dxa" w:w="1701"/>
             <w:vAlign w:val="center"/>
           </w:tcPr>
           <w:p>
@@ -2159,13 +1247,13 @@
                 <w:color w:val="000000"/>
                 <w:sz w:val="21"/>
               </w:rPr>
-              <w:t>人工核验过程与结果</w:t>
+              <w:t>采用文件位置</w:t>
             </w:r>
           </w:p>
         </w:tc>
         <w:tc>
           <w:tcPr>
-            <w:tcW w:type="dxa" w:w="7824"/>
+            <w:tcW w:type="dxa" w:w="7937"/>
             <w:vAlign w:val="center"/>
           </w:tcPr>
           <w:p>
@@ -2179,78 +1267,26 @@
                 <w:color w:val="000000"/>
                 <w:sz w:val="21"/>
               </w:rPr>
-              <w:t>待填写实际采用的核验方法、核验内容和结论，并给出相应计算、运行、原文核对或其他记录的位置。</w:t>
-            </w:r>
-            <w:r>
-              <w:br/>
-            </w:r>
-            <w:r>
-              <w:rPr>
-                <w:rFonts w:ascii="Times New Roman" w:hAnsi="Times New Roman" w:eastAsia="宋体"/>
-                <w:b w:val="0"/>
-                <w:color w:val="000000"/>
-                <w:sz w:val="21"/>
-              </w:rPr>
-            </w:r>
-          </w:p>
-        </w:tc>
-      </w:tr>
-      <w:tr>
-        <w:trPr/>
-        <w:tc>
-          <w:tcPr>
-            <w:tcW w:type="dxa" w:w="1814"/>
-            <w:vAlign w:val="center"/>
-          </w:tcPr>
-          <w:p>
-            <w:pPr>
-              <w:spacing w:line="264" w:lineRule="auto" w:after="0" w:before="0"/>
-            </w:pPr>
-            <w:r>
-              <w:rPr>
-                <w:rFonts w:ascii="Times New Roman" w:hAnsi="Times New Roman" w:eastAsia="宋体"/>
-                <w:b w:val="0"/>
-                <w:color w:val="000000"/>
-                <w:sz w:val="21"/>
-              </w:rPr>
-              <w:t>记录核对</w:t>
-            </w:r>
-          </w:p>
-        </w:tc>
-        <w:tc>
-          <w:tcPr>
-            <w:tcW w:type="dxa" w:w="7824"/>
-            <w:vAlign w:val="center"/>
-          </w:tcPr>
-          <w:p>
-            <w:pPr>
-              <w:spacing w:line="264" w:lineRule="auto" w:after="0" w:before="0"/>
-            </w:pPr>
-            <w:r>
-              <w:rPr>
-                <w:rFonts w:ascii="Times New Roman" w:hAnsi="Times New Roman" w:eastAsia="宋体"/>
-                <w:b w:val="0"/>
-                <w:color w:val="000000"/>
-                <w:sz w:val="21"/>
-              </w:rPr>
-              <w:t>核对状态：□ 已核对  □ 待核对</w:t>
-            </w:r>
-            <w:r>
-              <w:br/>
-            </w:r>
-            <w:r>
-              <w:rPr>
-                <w:rFonts w:ascii="Times New Roman" w:hAnsi="Times New Roman" w:eastAsia="宋体"/>
-                <w:b w:val="0"/>
-                <w:color w:val="000000"/>
-                <w:sz w:val="21"/>
-              </w:rPr>
-              <w:t>核对日期：待填写；记录编号或续页位置：待填写</w:t>
+              <w:t>06_绘图程序与数据/draw_figures.R；CSV和PNG子目录；绘图复现说明.txt、数据来源与校验.csv、图像校验.csv。</w:t>
             </w:r>
           </w:p>
         </w:tc>
       </w:tr>
     </w:tbl>
+    <w:p>
+      <w:pPr>
+        <w:spacing w:after="0"/>
+      </w:pPr>
+      <w:r>
+        <w:rPr>
+          <w:rFonts w:ascii="Times New Roman" w:hAnsi="Times New Roman" w:eastAsia="宋体"/>
+          <w:b w:val="0"/>
+          <w:color w:val="000000"/>
+          <w:sz w:val="19"/>
+        </w:rPr>
+        <w:t>记录中的运行、哈希比对和逐页检查由AI调用工具完成；团队人工审查与签认由本队负责。</w:t>
+      </w:r>
+    </w:p>
     <w:p>
       <w:r>
         <w:br w:type="page"/>
@@ -2262,7 +1298,7 @@
         <w:keepNext/>
       </w:pPr>
       <w:r>
-        <w:t>三 典型交互记录续表</w:t>
+        <w:t>三 典型交互实例</w:t>
       </w:r>
     </w:p>
     <w:p>
@@ -2271,21 +1307,7 @@
         <w:keepNext/>
       </w:pPr>
       <w:r>
-        <w:t>记录3 建模结果检查或公式整理</w:t>
-      </w:r>
-    </w:p>
-    <w:p>
-      <w:pPr>
-        <w:spacing w:after="120"/>
-      </w:pPr>
-      <w:r>
-        <w:rPr>
-          <w:rFonts w:ascii="Times New Roman" w:hAnsi="Times New Roman" w:eastAsia="宋体"/>
-          <w:b w:val="0"/>
-          <w:color w:val="000000"/>
-          <w:sz w:val="21"/>
-        </w:rPr>
-        <w:t>请从对应用途的真实交互中选取一例并完整保留原文。截图中的姓名、学校、账号等身份信息按匿名要求处理，保留任务相关内容。</w:t>
+        <w:t>实例2 数值检验的独立复现补件</w:t>
       </w:r>
     </w:p>
     <w:tbl>
@@ -2303,23 +1325,24 @@
           <w:insideV w:val="single" w:sz="6" w:color="D9D9D9"/>
         </w:tblBorders>
         <w:tblCellMar>
-          <w:top w:w="100" w:type="dxa"/>
-          <w:left w:w="100" w:type="dxa"/>
-          <w:bottom w:w="100" w:type="dxa"/>
-          <w:right w:w="100" w:type="dxa"/>
+          <w:top w:w="130" w:type="dxa"/>
+          <w:left w:w="130" w:type="dxa"/>
+          <w:bottom w:w="130" w:type="dxa"/>
+          <w:right w:w="130" w:type="dxa"/>
         </w:tblCellMar>
       </w:tblPr>
       <w:tblGrid>
-        <w:gridCol w:w="1814"/>
-        <w:gridCol w:w="7824"/>
+        <w:gridCol w:w="1701"/>
+        <w:gridCol w:w="7937"/>
       </w:tblGrid>
       <w:tr>
         <w:trPr>
+          <w:cantSplit/>
           <w:tblHeader/>
         </w:trPr>
         <w:tc>
           <w:tcPr>
-            <w:tcW w:type="dxa" w:w="1814"/>
+            <w:tcW w:type="dxa" w:w="1701"/>
             <w:vAlign w:val="center"/>
             <w:shd w:fill="E8EEF3"/>
           </w:tcPr>
@@ -2335,13 +1358,13 @@
                 <w:color w:val="000000"/>
                 <w:sz w:val="21"/>
               </w:rPr>
-              <w:t>记录字段</w:t>
+              <w:t>记录项</w:t>
             </w:r>
           </w:p>
         </w:tc>
         <w:tc>
           <w:tcPr>
-            <w:tcW w:type="dxa" w:w="7824"/>
+            <w:tcW w:type="dxa" w:w="7937"/>
             <w:vAlign w:val="center"/>
             <w:shd w:fill="E8EEF3"/>
           </w:tcPr>
@@ -2357,16 +1380,18 @@
                 <w:color w:val="000000"/>
                 <w:sz w:val="21"/>
               </w:rPr>
-              <w:t>填写内容</w:t>
+              <w:t>实际内容</w:t>
             </w:r>
           </w:p>
         </w:tc>
       </w:tr>
       <w:tr>
-        <w:trPr/>
+        <w:trPr>
+          <w:cantSplit/>
+        </w:trPr>
         <w:tc>
           <w:tcPr>
-            <w:tcW w:type="dxa" w:w="1814"/>
+            <w:tcW w:type="dxa" w:w="1701"/>
             <w:vAlign w:val="center"/>
           </w:tcPr>
           <w:p>
@@ -2380,13 +1405,13 @@
                 <w:color w:val="000000"/>
                 <w:sz w:val="21"/>
               </w:rPr>
-              <w:t>工具及环节</w:t>
+              <w:t>工具与时间</w:t>
             </w:r>
           </w:p>
         </w:tc>
         <w:tc>
           <w:tcPr>
-            <w:tcW w:type="dxa" w:w="7824"/>
+            <w:tcW w:type="dxa" w:w="7937"/>
             <w:vAlign w:val="center"/>
           </w:tcPr>
           <w:p>
@@ -2400,28 +1425,18 @@
                 <w:color w:val="000000"/>
                 <w:sz w:val="21"/>
               </w:rPr>
-              <w:t>工具：Codex 与 GPT6-Astra</w:t>
-            </w:r>
-            <w:r>
-              <w:br/>
-            </w:r>
-            <w:r>
-              <w:rPr>
-                <w:rFonts w:ascii="Times New Roman" w:hAnsi="Times New Roman" w:eastAsia="宋体"/>
-                <w:b w:val="0"/>
-                <w:color w:val="000000"/>
-                <w:sz w:val="21"/>
-              </w:rPr>
-              <w:t>环节：结果检验或论文撰写；实际日期与时间：待填写</w:t>
+              <w:t>Codex 与 GPT6-Astra；2026年9月13日；代码求解与结果检验。</w:t>
             </w:r>
           </w:p>
         </w:tc>
       </w:tr>
       <w:tr>
-        <w:trPr/>
+        <w:trPr>
+          <w:cantSplit/>
+        </w:trPr>
         <w:tc>
           <w:tcPr>
-            <w:tcW w:type="dxa" w:w="1814"/>
+            <w:tcW w:type="dxa" w:w="1701"/>
             <w:vAlign w:val="center"/>
           </w:tcPr>
           <w:p>
@@ -2435,13 +1450,13 @@
                 <w:color w:val="000000"/>
                 <w:sz w:val="21"/>
               </w:rPr>
-              <w:t>具体任务及材料</w:t>
+              <w:t>提示词节选</w:t>
             </w:r>
           </w:p>
         </w:tc>
         <w:tc>
           <w:tcPr>
-            <w:tcW w:type="dxa" w:w="7824"/>
+            <w:tcW w:type="dxa" w:w="7937"/>
             <w:vAlign w:val="center"/>
           </w:tcPr>
           <w:p>
@@ -2455,7 +1470,7 @@
                 <w:color w:val="000000"/>
                 <w:sz w:val="21"/>
               </w:rPr>
-              <w:t>待填写实际问题、输入文件或代码片段，以及本次交互需要解决的事项。</w:t>
+              <w:t>3. 你提到的：对论文采用的网格、时间误差、方法对照，至少补齐两份 CSV 的预期位置、实验根路径及 Matplotlib 依赖。这个请你核实，添加。</w:t>
             </w:r>
             <w:r>
               <w:br/>
@@ -2467,15 +1482,18 @@
                 <w:color w:val="000000"/>
                 <w:sz w:val="21"/>
               </w:rPr>
+              <w:t>历史废弃试验继续如实保留失败状态，不需要临交时把所有探索程序改成“通过”。 这个保留不动作。</w:t>
             </w:r>
           </w:p>
         </w:tc>
       </w:tr>
       <w:tr>
-        <w:trPr/>
+        <w:trPr>
+          <w:cantSplit/>
+        </w:trPr>
         <w:tc>
           <w:tcPr>
-            <w:tcW w:type="dxa" w:w="1814"/>
+            <w:tcW w:type="dxa" w:w="1701"/>
             <w:vAlign w:val="center"/>
           </w:tcPr>
           <w:p>
@@ -2489,13 +1507,13 @@
                 <w:color w:val="000000"/>
                 <w:sz w:val="21"/>
               </w:rPr>
-              <w:t>完整提示词</w:t>
+              <w:t>AI回复节选</w:t>
             </w:r>
           </w:p>
         </w:tc>
         <w:tc>
           <w:tcPr>
-            <w:tcW w:type="dxa" w:w="7824"/>
+            <w:tcW w:type="dxa" w:w="7937"/>
             <w:vAlign w:val="center"/>
           </w:tcPr>
           <w:p>
@@ -2509,49 +1527,18 @@
                 <w:color w:val="000000"/>
                 <w:sz w:val="21"/>
               </w:rPr>
-              <w:t>待粘贴真实提示词全文，或插入完整且清晰的截图。</w:t>
-            </w:r>
-            <w:r>
-              <w:br/>
-            </w:r>
-            <w:r>
-              <w:rPr>
-                <w:rFonts w:ascii="Times New Roman" w:hAnsi="Times New Roman" w:eastAsia="宋体"/>
-                <w:b w:val="0"/>
-                <w:color w:val="000000"/>
-                <w:sz w:val="21"/>
-              </w:rPr>
-            </w:r>
-            <w:r>
-              <w:br/>
-            </w:r>
-            <w:r>
-              <w:rPr>
-                <w:rFonts w:ascii="Times New Roman" w:hAnsi="Times New Roman" w:eastAsia="宋体"/>
-                <w:b w:val="0"/>
-                <w:color w:val="000000"/>
-                <w:sz w:val="21"/>
-              </w:rPr>
-            </w:r>
-            <w:r>
-              <w:br/>
-            </w:r>
-            <w:r>
-              <w:rPr>
-                <w:rFonts w:ascii="Times New Roman" w:hAnsi="Times New Roman" w:eastAsia="宋体"/>
-                <w:b w:val="0"/>
-                <w:color w:val="000000"/>
-                <w:sz w:val="21"/>
-              </w:rPr>
+              <w:t>数值检验补件已加入：两份 CSV 的预期位置、实验根路径、运行入口和包含 Matplotlib 的依赖清单。网格、时间误差、方法对照均已完成适量重跑并核验通过，具体命令见独立运行说明。</w:t>
             </w:r>
           </w:p>
         </w:tc>
       </w:tr>
       <w:tr>
-        <w:trPr/>
+        <w:trPr>
+          <w:cantSplit/>
+        </w:trPr>
         <w:tc>
           <w:tcPr>
-            <w:tcW w:type="dxa" w:w="1814"/>
+            <w:tcW w:type="dxa" w:w="1701"/>
             <w:vAlign w:val="center"/>
           </w:tcPr>
           <w:p>
@@ -2565,13 +1552,13 @@
                 <w:color w:val="000000"/>
                 <w:sz w:val="21"/>
               </w:rPr>
-              <w:t>AI回复全文</w:t>
+              <w:t>队伍处理与落地</w:t>
             </w:r>
           </w:p>
         </w:tc>
         <w:tc>
           <w:tcPr>
-            <w:tcW w:type="dxa" w:w="7824"/>
+            <w:tcW w:type="dxa" w:w="7937"/>
             <w:vAlign w:val="center"/>
           </w:tcPr>
           <w:p>
@@ -2585,60 +1572,18 @@
                 <w:color w:val="000000"/>
                 <w:sz w:val="21"/>
               </w:rPr>
-              <w:t>待粘贴真实 AI 回复全文，或插入完整且清晰的截图。内容较长可续页并标明位置。</w:t>
-            </w:r>
-            <w:r>
-              <w:br/>
-            </w:r>
-            <w:r>
-              <w:rPr>
-                <w:rFonts w:ascii="Times New Roman" w:hAnsi="Times New Roman" w:eastAsia="宋体"/>
-                <w:b w:val="0"/>
-                <w:color w:val="000000"/>
-                <w:sz w:val="21"/>
-              </w:rPr>
-            </w:r>
-            <w:r>
-              <w:br/>
-            </w:r>
-            <w:r>
-              <w:rPr>
-                <w:rFonts w:ascii="Times New Roman" w:hAnsi="Times New Roman" w:eastAsia="宋体"/>
-                <w:b w:val="0"/>
-                <w:color w:val="000000"/>
-                <w:sz w:val="21"/>
-              </w:rPr>
-            </w:r>
-            <w:r>
-              <w:br/>
-            </w:r>
-            <w:r>
-              <w:rPr>
-                <w:rFonts w:ascii="Times New Roman" w:hAnsi="Times New Roman" w:eastAsia="宋体"/>
-                <w:b w:val="0"/>
-                <w:color w:val="000000"/>
-                <w:sz w:val="21"/>
-              </w:rPr>
-            </w:r>
-            <w:r>
-              <w:br/>
-            </w:r>
-            <w:r>
-              <w:rPr>
-                <w:rFonts w:ascii="Times New Roman" w:hAnsi="Times New Roman" w:eastAsia="宋体"/>
-                <w:b w:val="0"/>
-                <w:color w:val="000000"/>
-                <w:sz w:val="21"/>
-              </w:rPr>
+              <w:t>补齐A_environment_observed.csv、A_radius_observed.csv、requirements.txt与run_checks.py。method_comparison.py仅将ROOT改为由脚本位置确定。按本队指令保留其他原检验源码和历史失败状态。</w:t>
             </w:r>
           </w:p>
         </w:tc>
       </w:tr>
       <w:tr>
-        <w:trPr/>
+        <w:trPr>
+          <w:cantSplit/>
+        </w:trPr>
         <w:tc>
           <w:tcPr>
-            <w:tcW w:type="dxa" w:w="1814"/>
+            <w:tcW w:type="dxa" w:w="1701"/>
             <w:vAlign w:val="center"/>
           </w:tcPr>
           <w:p>
@@ -2652,13 +1597,13 @@
                 <w:color w:val="000000"/>
                 <w:sz w:val="21"/>
               </w:rPr>
-              <w:t>队伍处理方式</w:t>
+              <w:t>核验方式与结果</w:t>
             </w:r>
           </w:p>
         </w:tc>
         <w:tc>
           <w:tcPr>
-            <w:tcW w:type="dxa" w:w="7824"/>
+            <w:tcW w:type="dxa" w:w="7937"/>
             <w:vAlign w:val="center"/>
           </w:tcPr>
           <w:p>
@@ -2672,27 +1617,18 @@
                 <w:color w:val="000000"/>
                 <w:sz w:val="21"/>
               </w:rPr>
-              <w:t>待填写：采纳、修改后采纳、未采纳或仅作参考；说明具体修改及理由，并标明最终采用位置。</w:t>
-            </w:r>
-            <w:r>
-              <w:br/>
-            </w:r>
-            <w:r>
-              <w:rPr>
-                <w:rFonts w:ascii="Times New Roman" w:hAnsi="Times New Roman" w:eastAsia="宋体"/>
-                <w:b w:val="0"/>
-                <w:color w:val="000000"/>
-                <w:sz w:val="21"/>
-              </w:rPr>
+              <w:t>新建虚拟环境安装并检查依赖。网格Q1 N20/40、时间误差Q1 N20及方法对照quick N100/200均实际退出0并核查内部报告。两CSV与生产输入一致，方法对照除ROOT赋值外语法树不变。未将小规模检查表述为全部高网格重跑。</w:t>
             </w:r>
           </w:p>
         </w:tc>
       </w:tr>
       <w:tr>
-        <w:trPr/>
+        <w:trPr>
+          <w:cantSplit/>
+        </w:trPr>
         <w:tc>
           <w:tcPr>
-            <w:tcW w:type="dxa" w:w="1814"/>
+            <w:tcW w:type="dxa" w:w="1701"/>
             <w:vAlign w:val="center"/>
           </w:tcPr>
           <w:p>
@@ -2706,13 +1642,13 @@
                 <w:color w:val="000000"/>
                 <w:sz w:val="21"/>
               </w:rPr>
-              <w:t>人工核验过程与结果</w:t>
+              <w:t>采用文件位置</w:t>
             </w:r>
           </w:p>
         </w:tc>
         <w:tc>
           <w:tcPr>
-            <w:tcW w:type="dxa" w:w="7824"/>
+            <w:tcW w:type="dxa" w:w="7937"/>
             <w:vAlign w:val="center"/>
           </w:tcPr>
           <w:p>
@@ -2726,27 +1662,131 @@
                 <w:color w:val="000000"/>
                 <w:sz w:val="21"/>
               </w:rPr>
-              <w:t>待填写实际采用的核验方法、核验内容和结论，并给出相应计算、运行、原文核对或其他记录的位置。</w:t>
+              <w:t>05_数值检验与实验/论文采用检验_独立运行说明.txt、本轮补件与运行核验.txt；Python检验源码下的run_checks.py、requirements.txt及paper_output/data_cleaned。</w:t>
             </w:r>
-            <w:r>
-              <w:br/>
-            </w:r>
+          </w:p>
+        </w:tc>
+      </w:tr>
+    </w:tbl>
+    <w:p>
+      <w:pPr>
+        <w:spacing w:after="0"/>
+      </w:pPr>
+      <w:r>
+        <w:rPr>
+          <w:rFonts w:ascii="Times New Roman" w:hAnsi="Times New Roman" w:eastAsia="宋体"/>
+          <w:b w:val="0"/>
+          <w:color w:val="000000"/>
+          <w:sz w:val="19"/>
+        </w:rPr>
+        <w:t>记录中的运行、哈希比对和逐页检查由AI调用工具完成；团队人工审查与签认由本队负责。</w:t>
+      </w:r>
+    </w:p>
+    <w:p>
+      <w:r>
+        <w:br w:type="page"/>
+      </w:r>
+    </w:p>
+    <w:p>
+      <w:pPr>
+        <w:pStyle w:val="Heading1"/>
+        <w:keepNext/>
+      </w:pPr>
+      <w:r>
+        <w:t>三 典型交互实例</w:t>
+      </w:r>
+    </w:p>
+    <w:p>
+      <w:pPr>
+        <w:pStyle w:val="Heading2"/>
+        <w:keepNext/>
+      </w:pPr>
+      <w:r>
+        <w:t>实例3 完整支撑文件清单</w:t>
+      </w:r>
+    </w:p>
+    <w:tbl>
+      <w:tblPr>
+        <w:tblW w:type="auto" w:w="0"/>
+        <w:jc w:val="center"/>
+        <w:tblLayout w:type="fixed"/>
+        <w:tblLook w:firstColumn="1" w:firstRow="1" w:lastColumn="0" w:lastRow="0" w:noHBand="0" w:noVBand="1" w:val="04A0"/>
+        <w:tblBorders>
+          <w:top w:val="single" w:sz="6" w:color="D9D9D9"/>
+          <w:left w:val="single" w:sz="6" w:color="D9D9D9"/>
+          <w:bottom w:val="single" w:sz="6" w:color="D9D9D9"/>
+          <w:right w:val="single" w:sz="6" w:color="D9D9D9"/>
+          <w:insideH w:val="single" w:sz="6" w:color="D9D9D9"/>
+          <w:insideV w:val="single" w:sz="6" w:color="D9D9D9"/>
+        </w:tblBorders>
+        <w:tblCellMar>
+          <w:top w:w="130" w:type="dxa"/>
+          <w:left w:w="130" w:type="dxa"/>
+          <w:bottom w:w="130" w:type="dxa"/>
+          <w:right w:w="130" w:type="dxa"/>
+        </w:tblCellMar>
+      </w:tblPr>
+      <w:tblGrid>
+        <w:gridCol w:w="1701"/>
+        <w:gridCol w:w="7937"/>
+      </w:tblGrid>
+      <w:tr>
+        <w:trPr>
+          <w:cantSplit/>
+          <w:tblHeader/>
+        </w:trPr>
+        <w:tc>
+          <w:tcPr>
+            <w:tcW w:type="dxa" w:w="1701"/>
+            <w:vAlign w:val="center"/>
+            <w:shd w:fill="E8EEF3"/>
+          </w:tcPr>
+          <w:p>
+            <w:pPr>
+              <w:spacing w:line="264" w:lineRule="auto" w:after="0" w:before="0"/>
+              <w:jc w:val="center"/>
+            </w:pPr>
             <w:r>
               <w:rPr>
                 <w:rFonts w:ascii="Times New Roman" w:hAnsi="Times New Roman" w:eastAsia="宋体"/>
-                <w:b w:val="0"/>
+                <w:b/>
                 <w:color w:val="000000"/>
                 <w:sz w:val="21"/>
               </w:rPr>
+              <w:t>记录项</w:t>
+            </w:r>
+          </w:p>
+        </w:tc>
+        <w:tc>
+          <w:tcPr>
+            <w:tcW w:type="dxa" w:w="7937"/>
+            <w:vAlign w:val="center"/>
+            <w:shd w:fill="E8EEF3"/>
+          </w:tcPr>
+          <w:p>
+            <w:pPr>
+              <w:spacing w:line="264" w:lineRule="auto" w:after="0" w:before="0"/>
+              <w:jc w:val="center"/>
+            </w:pPr>
+            <w:r>
+              <w:rPr>
+                <w:rFonts w:ascii="Times New Roman" w:hAnsi="Times New Roman" w:eastAsia="宋体"/>
+                <w:b/>
+                <w:color w:val="000000"/>
+                <w:sz w:val="21"/>
+              </w:rPr>
+              <w:t>实际内容</w:t>
             </w:r>
           </w:p>
         </w:tc>
       </w:tr>
       <w:tr>
-        <w:trPr/>
+        <w:trPr>
+          <w:cantSplit/>
+        </w:trPr>
         <w:tc>
           <w:tcPr>
-            <w:tcW w:type="dxa" w:w="1814"/>
+            <w:tcW w:type="dxa" w:w="1701"/>
             <w:vAlign w:val="center"/>
           </w:tcPr>
           <w:p>
@@ -2760,13 +1800,13 @@
                 <w:color w:val="000000"/>
                 <w:sz w:val="21"/>
               </w:rPr>
-              <w:t>记录核对</w:t>
+              <w:t>工具与时间</w:t>
             </w:r>
           </w:p>
         </w:tc>
         <w:tc>
           <w:tcPr>
-            <w:tcW w:type="dxa" w:w="7824"/>
+            <w:tcW w:type="dxa" w:w="7937"/>
             <w:vAlign w:val="center"/>
           </w:tcPr>
           <w:p>
@@ -2780,11 +1820,24 @@
                 <w:color w:val="000000"/>
                 <w:sz w:val="21"/>
               </w:rPr>
-              <w:t>核对状态：□ 已核对  □ 待核对</w:t>
+              <w:t>Codex 与 GPT6-Astra；2026年9月13日；论文撰写与辅助工作。</w:t>
             </w:r>
-            <w:r>
-              <w:br/>
-            </w:r>
+          </w:p>
+        </w:tc>
+      </w:tr>
+      <w:tr>
+        <w:trPr>
+          <w:cantSplit/>
+        </w:trPr>
+        <w:tc>
+          <w:tcPr>
+            <w:tcW w:type="dxa" w:w="1701"/>
+            <w:vAlign w:val="center"/>
+          </w:tcPr>
+          <w:p>
+            <w:pPr>
+              <w:spacing w:line="264" w:lineRule="auto" w:after="0" w:before="0"/>
+            </w:pPr>
             <w:r>
               <w:rPr>
                 <w:rFonts w:ascii="Times New Roman" w:hAnsi="Times New Roman" w:eastAsia="宋体"/>
@@ -2792,12 +1845,226 @@
                 <w:color w:val="000000"/>
                 <w:sz w:val="21"/>
               </w:rPr>
-              <w:t>核对日期：待填写；记录编号或续页位置：待填写</w:t>
+              <w:t>提示词节选</w:t>
+            </w:r>
+          </w:p>
+        </w:tc>
+        <w:tc>
+          <w:tcPr>
+            <w:tcW w:type="dxa" w:w="7937"/>
+            <w:vAlign w:val="center"/>
+          </w:tcPr>
+          <w:p>
+            <w:pPr>
+              <w:spacing w:line="264" w:lineRule="auto" w:after="0" w:before="0"/>
+            </w:pPr>
+            <w:r>
+              <w:rPr>
+                <w:rFonts w:ascii="Times New Roman" w:hAnsi="Times New Roman" w:eastAsia="宋体"/>
+                <w:b w:val="0"/>
+                <w:color w:val="000000"/>
+                <w:sz w:val="21"/>
+              </w:rPr>
+              <w:t>4. 在结束之后，我希望你生成所有支撑材料的文件列表，我要放在正文的附录中。</w:t>
+            </w:r>
+          </w:p>
+        </w:tc>
+      </w:tr>
+      <w:tr>
+        <w:trPr>
+          <w:cantSplit/>
+        </w:trPr>
+        <w:tc>
+          <w:tcPr>
+            <w:tcW w:type="dxa" w:w="1701"/>
+            <w:vAlign w:val="center"/>
+          </w:tcPr>
+          <w:p>
+            <w:pPr>
+              <w:spacing w:line="264" w:lineRule="auto" w:after="0" w:before="0"/>
+            </w:pPr>
+            <w:r>
+              <w:rPr>
+                <w:rFonts w:ascii="Times New Roman" w:hAnsi="Times New Roman" w:eastAsia="宋体"/>
+                <w:b w:val="0"/>
+                <w:color w:val="000000"/>
+                <w:sz w:val="21"/>
+              </w:rPr>
+              <w:t>AI回复节选</w:t>
+            </w:r>
+          </w:p>
+        </w:tc>
+        <w:tc>
+          <w:tcPr>
+            <w:tcW w:type="dxa" w:w="7937"/>
+            <w:vAlign w:val="center"/>
+          </w:tcPr>
+          <w:p>
+            <w:pPr>
+              <w:spacing w:line="264" w:lineRule="auto" w:after="0" w:before="0"/>
+            </w:pPr>
+            <w:r>
+              <w:rPr>
+                <w:rFonts w:ascii="Times New Roman" w:hAnsi="Times New Roman" w:eastAsia="宋体"/>
+                <w:b w:val="0"/>
+                <w:color w:val="000000"/>
+                <w:sz w:val="21"/>
+              </w:rPr>
+              <w:t>共 8 页，按目录逐项列出当前全部 137 个文件及用途，已核对无遗漏、无重复，可以放进正文附录。另有 TXT 完整清单。</w:t>
+            </w:r>
+          </w:p>
+        </w:tc>
+      </w:tr>
+      <w:tr>
+        <w:trPr>
+          <w:cantSplit/>
+        </w:trPr>
+        <w:tc>
+          <w:tcPr>
+            <w:tcW w:type="dxa" w:w="1701"/>
+            <w:vAlign w:val="center"/>
+          </w:tcPr>
+          <w:p>
+            <w:pPr>
+              <w:spacing w:line="264" w:lineRule="auto" w:after="0" w:before="0"/>
+            </w:pPr>
+            <w:r>
+              <w:rPr>
+                <w:rFonts w:ascii="Times New Roman" w:hAnsi="Times New Roman" w:eastAsia="宋体"/>
+                <w:b w:val="0"/>
+                <w:color w:val="000000"/>
+                <w:sz w:val="21"/>
+              </w:rPr>
+              <w:t>队伍处理与落地</w:t>
+            </w:r>
+          </w:p>
+        </w:tc>
+        <w:tc>
+          <w:tcPr>
+            <w:tcW w:type="dxa" w:w="7937"/>
+            <w:vAlign w:val="center"/>
+          </w:tcPr>
+          <w:p>
+            <w:pPr>
+              <w:spacing w:line="264" w:lineRule="auto" w:after="0" w:before="0"/>
+            </w:pPr>
+            <w:r>
+              <w:rPr>
+                <w:rFonts w:ascii="Times New Roman" w:hAnsi="Times New Roman" w:eastAsia="宋体"/>
+                <w:b w:val="0"/>
+                <w:color w:val="000000"/>
+                <w:sz w:val="21"/>
+              </w:rPr>
+              <w:t>按现有支撑目录生成逐文件路径和用途说明，提供独立DOCX供正文附录排版，并同步两份TXT清单。将空白模板和正式结果分别说明，保持本队当前目录结构。</w:t>
+            </w:r>
+          </w:p>
+        </w:tc>
+      </w:tr>
+      <w:tr>
+        <w:trPr>
+          <w:cantSplit/>
+        </w:trPr>
+        <w:tc>
+          <w:tcPr>
+            <w:tcW w:type="dxa" w:w="1701"/>
+            <w:vAlign w:val="center"/>
+          </w:tcPr>
+          <w:p>
+            <w:pPr>
+              <w:spacing w:line="264" w:lineRule="auto" w:after="0" w:before="0"/>
+            </w:pPr>
+            <w:r>
+              <w:rPr>
+                <w:rFonts w:ascii="Times New Roman" w:hAnsi="Times New Roman" w:eastAsia="宋体"/>
+                <w:b w:val="0"/>
+                <w:color w:val="000000"/>
+                <w:sz w:val="21"/>
+              </w:rPr>
+              <w:t>核验方式与结果</w:t>
+            </w:r>
+          </w:p>
+        </w:tc>
+        <w:tc>
+          <w:tcPr>
+            <w:tcW w:type="dxa" w:w="7937"/>
+            <w:vAlign w:val="center"/>
+          </w:tcPr>
+          <w:p>
+            <w:pPr>
+              <w:spacing w:line="264" w:lineRule="auto" w:after="0" w:before="0"/>
+            </w:pPr>
+            <w:r>
+              <w:rPr>
+                <w:rFonts w:ascii="Times New Roman" w:hAnsi="Times New Roman" w:eastAsia="宋体"/>
+                <w:b w:val="0"/>
+                <w:color w:val="000000"/>
+                <w:sz w:val="21"/>
+              </w:rPr>
+              <w:t>独立核查逐项重建清单路径，137个文件全部出现且各出现一次；DOCX与两份TXT清单一致。文件列表共8页，渲染后逐页检查。生成清单未改论文正文，四份正式结果表保持冻结版本。</w:t>
+            </w:r>
+          </w:p>
+        </w:tc>
+      </w:tr>
+      <w:tr>
+        <w:trPr>
+          <w:cantSplit/>
+        </w:trPr>
+        <w:tc>
+          <w:tcPr>
+            <w:tcW w:type="dxa" w:w="1701"/>
+            <w:vAlign w:val="center"/>
+          </w:tcPr>
+          <w:p>
+            <w:pPr>
+              <w:spacing w:line="264" w:lineRule="auto" w:after="0" w:before="0"/>
+            </w:pPr>
+            <w:r>
+              <w:rPr>
+                <w:rFonts w:ascii="Times New Roman" w:hAnsi="Times New Roman" w:eastAsia="宋体"/>
+                <w:b w:val="0"/>
+                <w:color w:val="000000"/>
+                <w:sz w:val="21"/>
+              </w:rPr>
+              <w:t>采用文件位置</w:t>
+            </w:r>
+          </w:p>
+        </w:tc>
+        <w:tc>
+          <w:tcPr>
+            <w:tcW w:type="dxa" w:w="7937"/>
+            <w:vAlign w:val="center"/>
+          </w:tcPr>
+          <w:p>
+            <w:pPr>
+              <w:spacing w:line="264" w:lineRule="auto" w:after="0" w:before="0"/>
+            </w:pPr>
+            <w:r>
+              <w:rPr>
+                <w:rFonts w:ascii="Times New Roman" w:hAnsi="Times New Roman" w:eastAsia="宋体"/>
+                <w:b w:val="0"/>
+                <w:color w:val="000000"/>
+                <w:sz w:val="21"/>
+              </w:rPr>
+              <w:t>支撑材料文件列表_附录用.docx；支撑根目录00_文件清单.txt及00_可用于论文附录的支撑清单.txt。</w:t>
             </w:r>
           </w:p>
         </w:tc>
       </w:tr>
     </w:tbl>
+    <w:p>
+      <w:pPr>
+        <w:spacing w:after="0"/>
+      </w:pPr>
+      <w:r>
+        <w:rPr>
+          <w:rFonts w:ascii="Times New Roman" w:hAnsi="Times New Roman" w:eastAsia="宋体"/>
+          <w:b w:val="0"/>
+          <w:color w:val="000000"/>
+          <w:sz w:val="19"/>
+        </w:rPr>
+        <w:t>记录中的运行、哈希比对和逐页检查由AI调用工具完成；团队人工审查与签认由本队负责。</w:t>
+      </w:r>
+    </w:p>
     <w:p>
       <w:r>
         <w:br w:type="page"/>
@@ -2810,15 +2077,6 @@
       </w:pPr>
       <w:r>
         <w:t>四 采纳修改及人工主导确认</w:t>
-      </w:r>
-    </w:p>
-    <w:p>
-      <w:pPr>
-        <w:pStyle w:val="Heading2"/>
-        <w:keepNext/>
-      </w:pPr>
-      <w:r>
-        <w:t>采纳与修改记录</w:t>
       </w:r>
     </w:p>
     <w:tbl>
@@ -2843,9 +2101,9 @@
         </w:tblCellMar>
       </w:tblPr>
       <w:tblGrid>
-        <w:gridCol w:w="1361"/>
-        <w:gridCol w:w="3742"/>
-        <w:gridCol w:w="4535"/>
+        <w:gridCol w:w="1134"/>
+        <w:gridCol w:w="2835"/>
+        <w:gridCol w:w="5669"/>
       </w:tblGrid>
       <w:tr>
         <w:trPr>
@@ -2854,7 +2112,7 @@
         </w:trPr>
         <w:tc>
           <w:tcPr>
-            <w:tcW w:type="dxa" w:w="1361"/>
+            <w:tcW w:type="dxa" w:w="1134"/>
             <w:vAlign w:val="center"/>
             <w:shd w:fill="E8EEF3"/>
           </w:tcPr>
@@ -2868,15 +2126,15 @@
                 <w:rFonts w:ascii="Times New Roman" w:hAnsi="Times New Roman" w:eastAsia="宋体"/>
                 <w:b/>
                 <w:color w:val="000000"/>
-                <w:sz w:val="21"/>
+                <w:sz w:val="20"/>
               </w:rPr>
-              <w:t>内容类别</w:t>
+              <w:t>类别</w:t>
             </w:r>
           </w:p>
         </w:tc>
         <w:tc>
           <w:tcPr>
-            <w:tcW w:type="dxa" w:w="3742"/>
+            <w:tcW w:type="dxa" w:w="2835"/>
             <w:vAlign w:val="center"/>
             <w:shd w:fill="E8EEF3"/>
           </w:tcPr>
@@ -2890,373 +2148,9 @@
                 <w:rFonts w:ascii="Times New Roman" w:hAnsi="Times New Roman" w:eastAsia="宋体"/>
                 <w:b/>
                 <w:color w:val="000000"/>
-                <w:sz w:val="21"/>
+                <w:sz w:val="20"/>
               </w:rPr>
-              <w:t>AI相关工作</w:t>
-            </w:r>
-          </w:p>
-        </w:tc>
-        <w:tc>
-          <w:tcPr>
-            <w:tcW w:type="dxa" w:w="4535"/>
-            <w:vAlign w:val="center"/>
-            <w:shd w:fill="E8EEF3"/>
-          </w:tcPr>
-          <w:p>
-            <w:pPr>
-              <w:spacing w:line="264" w:lineRule="auto" w:after="0" w:before="0"/>
-              <w:jc w:val="center"/>
-            </w:pPr>
-            <w:r>
-              <w:rPr>
-                <w:rFonts w:ascii="Times New Roman" w:hAnsi="Times New Roman" w:eastAsia="宋体"/>
-                <w:b/>
-                <w:color w:val="000000"/>
-                <w:sz w:val="21"/>
-              </w:rPr>
-              <w:t>队伍采纳及修改情况</w:t>
-            </w:r>
-          </w:p>
-        </w:tc>
-      </w:tr>
-      <w:tr>
-        <w:trPr>
-          <w:cantSplit/>
-        </w:trPr>
-        <w:tc>
-          <w:tcPr>
-            <w:tcW w:type="dxa" w:w="1361"/>
-            <w:vAlign w:val="center"/>
-          </w:tcPr>
-          <w:p>
-            <w:pPr>
-              <w:spacing w:line="264" w:lineRule="auto" w:after="0" w:before="0"/>
-              <w:jc w:val="center"/>
-            </w:pPr>
-            <w:r>
-              <w:rPr>
-                <w:rFonts w:ascii="Times New Roman" w:hAnsi="Times New Roman" w:eastAsia="宋体"/>
-                <w:b w:val="0"/>
-                <w:color w:val="000000"/>
-                <w:sz w:val="21"/>
-              </w:rPr>
-              <w:t>建模思路</w:t>
-            </w:r>
-          </w:p>
-        </w:tc>
-        <w:tc>
-          <w:tcPr>
-            <w:tcW w:type="dxa" w:w="3742"/>
-            <w:vAlign w:val="center"/>
-          </w:tcPr>
-          <w:p>
-            <w:pPr>
-              <w:spacing w:line="264" w:lineRule="auto" w:after="0" w:before="0"/>
-            </w:pPr>
-            <w:r>
-              <w:rPr>
-                <w:rFonts w:ascii="Times New Roman" w:hAnsi="Times New Roman" w:eastAsia="宋体"/>
-                <w:b w:val="0"/>
-                <w:color w:val="000000"/>
-                <w:sz w:val="21"/>
-              </w:rPr>
-              <w:t>题意理解与文献线索；模型设计是否涉及 AI 建议待本队确认。</w:t>
-            </w:r>
-          </w:p>
-        </w:tc>
-        <w:tc>
-          <w:tcPr>
-            <w:tcW w:type="dxa" w:w="4535"/>
-            <w:vAlign w:val="center"/>
-          </w:tcPr>
-          <w:p>
-            <w:pPr>
-              <w:spacing w:line="264" w:lineRule="auto" w:after="0" w:before="0"/>
-            </w:pPr>
-            <w:r>
-              <w:rPr>
-                <w:rFonts w:ascii="Times New Roman" w:hAnsi="Times New Roman" w:eastAsia="宋体"/>
-                <w:b w:val="0"/>
-                <w:color w:val="000000"/>
-                <w:sz w:val="21"/>
-              </w:rPr>
-              <w:t>待填写采纳范围、调整内容及理由；未采纳亦须据实注明。</w:t>
-            </w:r>
-          </w:p>
-        </w:tc>
-      </w:tr>
-      <w:tr>
-        <w:trPr>
-          <w:cantSplit/>
-        </w:trPr>
-        <w:tc>
-          <w:tcPr>
-            <w:tcW w:type="dxa" w:w="1361"/>
-            <w:vAlign w:val="center"/>
-          </w:tcPr>
-          <w:p>
-            <w:pPr>
-              <w:spacing w:line="264" w:lineRule="auto" w:after="0" w:before="0"/>
-              <w:jc w:val="center"/>
-            </w:pPr>
-            <w:r>
-              <w:rPr>
-                <w:rFonts w:ascii="Times New Roman" w:hAnsi="Times New Roman" w:eastAsia="宋体"/>
-                <w:b w:val="0"/>
-                <w:color w:val="000000"/>
-                <w:sz w:val="21"/>
-              </w:rPr>
-              <w:t>公式</w:t>
-            </w:r>
-          </w:p>
-        </w:tc>
-        <w:tc>
-          <w:tcPr>
-            <w:tcW w:type="dxa" w:w="3742"/>
-            <w:vAlign w:val="center"/>
-          </w:tcPr>
-          <w:p>
-            <w:pPr>
-              <w:spacing w:line="264" w:lineRule="auto" w:after="0" w:before="0"/>
-            </w:pPr>
-            <w:r>
-              <w:rPr>
-                <w:rFonts w:ascii="Times New Roman" w:hAnsi="Times New Roman" w:eastAsia="宋体"/>
-                <w:b w:val="0"/>
-                <w:color w:val="000000"/>
-                <w:sz w:val="21"/>
-              </w:rPr>
-              <w:t>整理推导步骤、统一符号、检查公式衔接及变量说明。</w:t>
-            </w:r>
-          </w:p>
-        </w:tc>
-        <w:tc>
-          <w:tcPr>
-            <w:tcW w:type="dxa" w:w="4535"/>
-            <w:vAlign w:val="center"/>
-          </w:tcPr>
-          <w:p>
-            <w:pPr>
-              <w:spacing w:line="264" w:lineRule="auto" w:after="0" w:before="0"/>
-            </w:pPr>
-            <w:r>
-              <w:rPr>
-                <w:rFonts w:ascii="Times New Roman" w:hAnsi="Times New Roman" w:eastAsia="宋体"/>
-                <w:b w:val="0"/>
-                <w:color w:val="000000"/>
-                <w:sz w:val="21"/>
-              </w:rPr>
-              <w:t>待填写修改前后内容及对应公式位置。</w:t>
-            </w:r>
-          </w:p>
-        </w:tc>
-      </w:tr>
-      <w:tr>
-        <w:trPr>
-          <w:cantSplit/>
-        </w:trPr>
-        <w:tc>
-          <w:tcPr>
-            <w:tcW w:type="dxa" w:w="1361"/>
-            <w:vAlign w:val="center"/>
-          </w:tcPr>
-          <w:p>
-            <w:pPr>
-              <w:spacing w:line="264" w:lineRule="auto" w:after="0" w:before="0"/>
-              <w:jc w:val="center"/>
-            </w:pPr>
-            <w:r>
-              <w:rPr>
-                <w:rFonts w:ascii="Times New Roman" w:hAnsi="Times New Roman" w:eastAsia="宋体"/>
-                <w:b w:val="0"/>
-                <w:color w:val="000000"/>
-                <w:sz w:val="21"/>
-              </w:rPr>
-              <w:t>代码</w:t>
-            </w:r>
-          </w:p>
-        </w:tc>
-        <w:tc>
-          <w:tcPr>
-            <w:tcW w:type="dxa" w:w="3742"/>
-            <w:vAlign w:val="center"/>
-          </w:tcPr>
-          <w:p>
-            <w:pPr>
-              <w:spacing w:line="264" w:lineRule="auto" w:after="0" w:before="0"/>
-            </w:pPr>
-            <w:r>
-              <w:rPr>
-                <w:rFonts w:ascii="Times New Roman" w:hAnsi="Times New Roman" w:eastAsia="宋体"/>
-                <w:b w:val="0"/>
-                <w:color w:val="000000"/>
-                <w:sz w:val="21"/>
-              </w:rPr>
-              <w:t>源代码语法检查与部分程序调试。</w:t>
-            </w:r>
-          </w:p>
-        </w:tc>
-        <w:tc>
-          <w:tcPr>
-            <w:tcW w:type="dxa" w:w="4535"/>
-            <w:vAlign w:val="center"/>
-          </w:tcPr>
-          <w:p>
-            <w:pPr>
-              <w:spacing w:line="264" w:lineRule="auto" w:after="0" w:before="0"/>
-            </w:pPr>
-            <w:r>
-              <w:rPr>
-                <w:rFonts w:ascii="Times New Roman" w:hAnsi="Times New Roman" w:eastAsia="宋体"/>
-                <w:b w:val="0"/>
-                <w:color w:val="000000"/>
-                <w:sz w:val="21"/>
-              </w:rPr>
-              <w:t>待填写报错定位、实际修改位置及修改后核验记录。</w:t>
-            </w:r>
-          </w:p>
-        </w:tc>
-      </w:tr>
-      <w:tr>
-        <w:trPr>
-          <w:cantSplit/>
-        </w:trPr>
-        <w:tc>
-          <w:tcPr>
-            <w:tcW w:type="dxa" w:w="1361"/>
-            <w:vAlign w:val="center"/>
-          </w:tcPr>
-          <w:p>
-            <w:pPr>
-              <w:spacing w:line="264" w:lineRule="auto" w:after="0" w:before="0"/>
-              <w:jc w:val="center"/>
-            </w:pPr>
-            <w:r>
-              <w:rPr>
-                <w:rFonts w:ascii="Times New Roman" w:hAnsi="Times New Roman" w:eastAsia="宋体"/>
-                <w:b w:val="0"/>
-                <w:color w:val="000000"/>
-                <w:sz w:val="21"/>
-              </w:rPr>
-              <w:t>分析内容</w:t>
-            </w:r>
-          </w:p>
-        </w:tc>
-        <w:tc>
-          <w:tcPr>
-            <w:tcW w:type="dxa" w:w="3742"/>
-            <w:vAlign w:val="center"/>
-          </w:tcPr>
-          <w:p>
-            <w:pPr>
-              <w:spacing w:line="264" w:lineRule="auto" w:after="0" w:before="0"/>
-            </w:pPr>
-            <w:r>
-              <w:rPr>
-                <w:rFonts w:ascii="Times New Roman" w:hAnsi="Times New Roman" w:eastAsia="宋体"/>
-                <w:b w:val="0"/>
-                <w:color w:val="000000"/>
-                <w:sz w:val="21"/>
-              </w:rPr>
-              <w:t>检查结果与题设及模型条件的对应关系，核对单位、趋势和表达。</w:t>
-            </w:r>
-          </w:p>
-        </w:tc>
-        <w:tc>
-          <w:tcPr>
-            <w:tcW w:type="dxa" w:w="4535"/>
-            <w:vAlign w:val="center"/>
-          </w:tcPr>
-          <w:p>
-            <w:pPr>
-              <w:spacing w:line="264" w:lineRule="auto" w:after="0" w:before="0"/>
-            </w:pPr>
-            <w:r>
-              <w:rPr>
-                <w:rFonts w:ascii="Times New Roman" w:hAnsi="Times New Roman" w:eastAsia="宋体"/>
-                <w:b w:val="0"/>
-                <w:color w:val="000000"/>
-                <w:sz w:val="21"/>
-              </w:rPr>
-              <w:t>待填写采纳意见、修订结果与依据，以及保留或未采纳的内容。</w:t>
-            </w:r>
-          </w:p>
-        </w:tc>
-      </w:tr>
-    </w:tbl>
-    <w:p>
-      <w:pPr>
-        <w:pStyle w:val="Heading2"/>
-        <w:keepNext/>
-      </w:pPr>
-      <w:r>
-        <w:t>本队主导情况确认</w:t>
-      </w:r>
-    </w:p>
-    <w:p>
-      <w:pPr>
-        <w:spacing w:after="100"/>
-      </w:pPr>
-      <w:r>
-        <w:rPr>
-          <w:rFonts w:ascii="Times New Roman" w:hAnsi="Times New Roman" w:eastAsia="宋体"/>
-          <w:b w:val="0"/>
-          <w:color w:val="000000"/>
-          <w:sz w:val="20"/>
-        </w:rPr>
-        <w:t>由本队逐项核实并勾选。若仍需补充，填写实际情况；本表不预先代替本队作出确认。</w:t>
-      </w:r>
-    </w:p>
-    <w:tbl>
-      <w:tblPr>
-        <w:tblW w:type="auto" w:w="0"/>
-        <w:jc w:val="center"/>
-        <w:tblLayout w:type="fixed"/>
-        <w:tblLook w:firstColumn="1" w:firstRow="1" w:lastColumn="0" w:lastRow="0" w:noHBand="0" w:noVBand="1" w:val="04A0"/>
-        <w:tblBorders>
-          <w:top w:val="single" w:sz="6" w:color="D9D9D9"/>
-          <w:left w:val="single" w:sz="6" w:color="D9D9D9"/>
-          <w:bottom w:val="single" w:sz="6" w:color="D9D9D9"/>
-          <w:right w:val="single" w:sz="6" w:color="D9D9D9"/>
-          <w:insideH w:val="single" w:sz="6" w:color="D9D9D9"/>
-          <w:insideV w:val="single" w:sz="6" w:color="D9D9D9"/>
-        </w:tblBorders>
-        <w:tblCellMar>
-          <w:top w:w="78" w:type="dxa"/>
-          <w:left w:w="78" w:type="dxa"/>
-          <w:bottom w:w="78" w:type="dxa"/>
-          <w:right w:w="78" w:type="dxa"/>
-        </w:tblCellMar>
-      </w:tblPr>
-      <w:tblGrid>
-        <w:gridCol w:w="1644"/>
-        <w:gridCol w:w="5669"/>
-        <w:gridCol w:w="2324"/>
-      </w:tblGrid>
-      <w:tr>
-        <w:trPr>
-          <w:cantSplit/>
-          <w:tblHeader/>
-        </w:trPr>
-        <w:tc>
-          <w:tcPr>
-            <w:tcW w:type="dxa" w:w="1644"/>
-            <w:vAlign w:val="center"/>
-            <w:shd w:fill="E8EEF3"/>
-          </w:tcPr>
-          <w:p>
-            <w:pPr>
-              <w:spacing w:line="264" w:lineRule="auto" w:after="0" w:before="0"/>
-              <w:jc w:val="center"/>
-            </w:pPr>
-            <w:r>
-              <w:rPr>
-                <w:rFonts w:ascii="Times New Roman" w:hAnsi="Times New Roman" w:eastAsia="宋体"/>
-                <w:b/>
-                <w:color w:val="000000"/>
-                <w:sz w:val="21"/>
-              </w:rPr>
-              <w:t>核心环节</w:t>
+              <w:t>AI辅助内容</w:t>
             </w:r>
           </w:p>
         </w:tc>
@@ -3276,31 +2170,9 @@
                 <w:rFonts w:ascii="Times New Roman" w:hAnsi="Times New Roman" w:eastAsia="宋体"/>
                 <w:b/>
                 <w:color w:val="000000"/>
-                <w:sz w:val="21"/>
+                <w:sz w:val="20"/>
               </w:rPr>
-              <w:t>本队确认事项</w:t>
-            </w:r>
-          </w:p>
-        </w:tc>
-        <w:tc>
-          <w:tcPr>
-            <w:tcW w:type="dxa" w:w="2324"/>
-            <w:vAlign w:val="center"/>
-            <w:shd w:fill="E8EEF3"/>
-          </w:tcPr>
-          <w:p>
-            <w:pPr>
-              <w:spacing w:line="264" w:lineRule="auto" w:after="0" w:before="0"/>
-              <w:jc w:val="center"/>
-            </w:pPr>
-            <w:r>
-              <w:rPr>
-                <w:rFonts w:ascii="Times New Roman" w:hAnsi="Times New Roman" w:eastAsia="宋体"/>
-                <w:b/>
-                <w:color w:val="000000"/>
-                <w:sz w:val="21"/>
-              </w:rPr>
-              <w:t>核实状态</w:t>
+              <w:t>采用及修改情况</w:t>
             </w:r>
           </w:p>
         </w:tc>
@@ -3311,7 +2183,7 @@
         </w:trPr>
         <w:tc>
           <w:tcPr>
-            <w:tcW w:type="dxa" w:w="1644"/>
+            <w:tcW w:type="dxa" w:w="1134"/>
             <w:vAlign w:val="center"/>
           </w:tcPr>
           <w:p>
@@ -3324,9 +2196,29 @@
                 <w:rFonts w:ascii="Times New Roman" w:hAnsi="Times New Roman" w:eastAsia="宋体"/>
                 <w:b w:val="0"/>
                 <w:color w:val="000000"/>
-                <w:sz w:val="21"/>
+                <w:sz w:val="20"/>
               </w:rPr>
-              <w:t>模型创新与选型</w:t>
+              <w:t>建模思路</w:t>
+            </w:r>
+          </w:p>
+        </w:tc>
+        <w:tc>
+          <w:tcPr>
+            <w:tcW w:type="dxa" w:w="2835"/>
+            <w:vAlign w:val="center"/>
+          </w:tcPr>
+          <w:p>
+            <w:pPr>
+              <w:spacing w:line="264" w:lineRule="auto" w:after="0" w:before="0"/>
+            </w:pPr>
+            <w:r>
+              <w:rPr>
+                <w:rFonts w:ascii="Times New Roman" w:hAnsi="Times New Roman" w:eastAsia="宋体"/>
+                <w:b w:val="0"/>
+                <w:color w:val="000000"/>
+                <w:sz w:val="20"/>
+              </w:rPr>
+              <w:t>题意整理、假设边界与模型联系检查。</w:t>
             </w:r>
           </w:p>
         </w:tc>
@@ -3344,29 +2236,9 @@
                 <w:rFonts w:ascii="Times New Roman" w:hAnsi="Times New Roman" w:eastAsia="宋体"/>
                 <w:b w:val="0"/>
                 <w:color w:val="000000"/>
-                <w:sz w:val="21"/>
+                <w:sz w:val="20"/>
               </w:rPr>
-              <w:t>模型方案的选择、适用性判断及创新内容由本队主导完成。</w:t>
-            </w:r>
-          </w:p>
-        </w:tc>
-        <w:tc>
-          <w:tcPr>
-            <w:tcW w:type="dxa" w:w="2324"/>
-            <w:vAlign w:val="center"/>
-          </w:tcPr>
-          <w:p>
-            <w:pPr>
-              <w:spacing w:line="264" w:lineRule="auto" w:after="0" w:before="0"/>
-            </w:pPr>
-            <w:r>
-              <w:rPr>
-                <w:rFonts w:ascii="Times New Roman" w:hAnsi="Times New Roman" w:eastAsia="宋体"/>
-                <w:b w:val="0"/>
-                <w:color w:val="000000"/>
-                <w:sz w:val="21"/>
-              </w:rPr>
-              <w:t>□ 已确认  □ 待确认</w:t>
+              <w:t>围绕热湿耦合和收缩条件组织四问；结果限定为给定假设下的预测，不将数值检验写成实测验证。</w:t>
             </w:r>
           </w:p>
         </w:tc>
@@ -3377,7 +2249,7 @@
         </w:trPr>
         <w:tc>
           <w:tcPr>
-            <w:tcW w:type="dxa" w:w="1644"/>
+            <w:tcW w:type="dxa" w:w="1134"/>
             <w:vAlign w:val="center"/>
           </w:tcPr>
           <w:p>
@@ -3390,9 +2262,29 @@
                 <w:rFonts w:ascii="Times New Roman" w:hAnsi="Times New Roman" w:eastAsia="宋体"/>
                 <w:b w:val="0"/>
                 <w:color w:val="000000"/>
-                <w:sz w:val="21"/>
+                <w:sz w:val="20"/>
               </w:rPr>
-              <w:t>公式推导</w:t>
+              <w:t>公式</w:t>
+            </w:r>
+          </w:p>
+        </w:tc>
+        <w:tc>
+          <w:tcPr>
+            <w:tcW w:type="dxa" w:w="2835"/>
+            <w:vAlign w:val="center"/>
+          </w:tcPr>
+          <w:p>
+            <w:pPr>
+              <w:spacing w:line="264" w:lineRule="auto" w:after="0" w:before="0"/>
+            </w:pPr>
+            <w:r>
+              <w:rPr>
+                <w:rFonts w:ascii="Times New Roman" w:hAnsi="Times New Roman" w:eastAsia="宋体"/>
+                <w:b w:val="0"/>
+                <w:color w:val="000000"/>
+                <w:sz w:val="20"/>
+              </w:rPr>
+              <w:t>公式、量纲与符号整理。</w:t>
             </w:r>
           </w:p>
         </w:tc>
@@ -3410,29 +2302,9 @@
                 <w:rFonts w:ascii="Times New Roman" w:hAnsi="Times New Roman" w:eastAsia="宋体"/>
                 <w:b w:val="0"/>
                 <w:color w:val="000000"/>
-                <w:sz w:val="21"/>
+                <w:sz w:val="20"/>
               </w:rPr>
-              <w:t>关键公式及推导由本队理解、核查并主导完成。</w:t>
-            </w:r>
-          </w:p>
-        </w:tc>
-        <w:tc>
-          <w:tcPr>
-            <w:tcW w:type="dxa" w:w="2324"/>
-            <w:vAlign w:val="center"/>
-          </w:tcPr>
-          <w:p>
-            <w:pPr>
-              <w:spacing w:line="264" w:lineRule="auto" w:after="0" w:before="0"/>
-            </w:pPr>
-            <w:r>
-              <w:rPr>
-                <w:rFonts w:ascii="Times New Roman" w:hAnsi="Times New Roman" w:eastAsia="宋体"/>
-                <w:b w:val="0"/>
-                <w:color w:val="000000"/>
-                <w:sz w:val="21"/>
-              </w:rPr>
-              <w:t>□ 已确认  □ 待确认</w:t>
+              <w:t>区分有效体积热容和干骨架密度，区分连续阈值时刻和严格报告时刻；具体表达以论文采用方程及冻结程序为准。</w:t>
             </w:r>
           </w:p>
         </w:tc>
@@ -3443,7 +2315,7 @@
         </w:trPr>
         <w:tc>
           <w:tcPr>
-            <w:tcW w:type="dxa" w:w="1644"/>
+            <w:tcW w:type="dxa" w:w="1134"/>
             <w:vAlign w:val="center"/>
           </w:tcPr>
           <w:p>
@@ -3456,9 +2328,29 @@
                 <w:rFonts w:ascii="Times New Roman" w:hAnsi="Times New Roman" w:eastAsia="宋体"/>
                 <w:b w:val="0"/>
                 <w:color w:val="000000"/>
-                <w:sz w:val="21"/>
+                <w:sz w:val="20"/>
               </w:rPr>
-              <w:t>代码逻辑</w:t>
+              <w:t>代码</w:t>
+            </w:r>
+          </w:p>
+        </w:tc>
+        <w:tc>
+          <w:tcPr>
+            <w:tcW w:type="dxa" w:w="2835"/>
+            <w:vAlign w:val="center"/>
+          </w:tcPr>
+          <w:p>
+            <w:pPr>
+              <w:spacing w:line="264" w:lineRule="auto" w:after="0" w:before="0"/>
+            </w:pPr>
+            <w:r>
+              <w:rPr>
+                <w:rFonts w:ascii="Times New Roman" w:hAnsi="Times New Roman" w:eastAsia="宋体"/>
+                <w:b w:val="0"/>
+                <w:color w:val="000000"/>
+                <w:sz w:val="20"/>
+              </w:rPr>
+              <w:t>语法调试、依赖与复现入口、绘图适配。</w:t>
             </w:r>
           </w:p>
         </w:tc>
@@ -3476,29 +2368,9 @@
                 <w:rFonts w:ascii="Times New Roman" w:hAnsi="Times New Roman" w:eastAsia="宋体"/>
                 <w:b w:val="0"/>
                 <w:color w:val="000000"/>
-                <w:sz w:val="21"/>
+                <w:sz w:val="20"/>
               </w:rPr>
-              <w:t>核心代码逻辑由本队掌握并完成必要人工审查；运行结果经本队核验。</w:t>
-            </w:r>
-          </w:p>
-        </w:tc>
-        <w:tc>
-          <w:tcPr>
-            <w:tcW w:type="dxa" w:w="2324"/>
-            <w:vAlign w:val="center"/>
-          </w:tcPr>
-          <w:p>
-            <w:pPr>
-              <w:spacing w:line="264" w:lineRule="auto" w:after="0" w:before="0"/>
-            </w:pPr>
-            <w:r>
-              <w:rPr>
-                <w:rFonts w:ascii="Times New Roman" w:hAnsi="Times New Roman" w:eastAsia="宋体"/>
-                <w:b w:val="0"/>
-                <w:color w:val="000000"/>
-                <w:sz w:val="21"/>
-              </w:rPr>
-              <w:t>□ 已确认  □ 待确认</w:t>
+              <w:t>本次采纳相对ROOT定位和新增运行入口；正式03及结果04字节保持，历史废弃检验未修复或改判。</w:t>
             </w:r>
           </w:p>
         </w:tc>
@@ -3509,7 +2381,7 @@
         </w:trPr>
         <w:tc>
           <w:tcPr>
-            <w:tcW w:type="dxa" w:w="1644"/>
+            <w:tcW w:type="dxa" w:w="1134"/>
             <w:vAlign w:val="center"/>
           </w:tcPr>
           <w:p>
@@ -3522,9 +2394,29 @@
                 <w:rFonts w:ascii="Times New Roman" w:hAnsi="Times New Roman" w:eastAsia="宋体"/>
                 <w:b w:val="0"/>
                 <w:color w:val="000000"/>
-                <w:sz w:val="21"/>
+                <w:sz w:val="20"/>
               </w:rPr>
-              <w:t>核心论证</w:t>
+              <w:t>分析与材料</w:t>
+            </w:r>
+          </w:p>
+        </w:tc>
+        <w:tc>
+          <w:tcPr>
+            <w:tcW w:type="dxa" w:w="2835"/>
+            <w:vAlign w:val="center"/>
+          </w:tcPr>
+          <w:p>
+            <w:pPr>
+              <w:spacing w:line="264" w:lineRule="auto" w:after="0" w:before="0"/>
+            </w:pPr>
+            <w:r>
+              <w:rPr>
+                <w:rFonts w:ascii="Times New Roman" w:hAnsi="Times New Roman" w:eastAsia="宋体"/>
+                <w:b w:val="0"/>
+                <w:color w:val="000000"/>
+                <w:sz w:val="20"/>
+              </w:rPr>
+              <w:t>结果一致性检查、支撑整理和附录清单。</w:t>
             </w:r>
           </w:p>
         </w:tc>
@@ -3542,15 +2434,105 @@
                 <w:rFonts w:ascii="Times New Roman" w:hAnsi="Times New Roman" w:eastAsia="宋体"/>
                 <w:b w:val="0"/>
                 <w:color w:val="000000"/>
-                <w:sz w:val="21"/>
+                <w:sz w:val="20"/>
               </w:rPr>
-              <w:t>结论、解释及局限性由本队审查并主导完成。</w:t>
+              <w:t>形成三项适量检验记录、绘图补件和137文件清单；保留检验范围、图像重绘差异及模型适用边界。</w:t>
+            </w:r>
+          </w:p>
+        </w:tc>
+      </w:tr>
+    </w:tbl>
+    <w:p>
+      <w:pPr>
+        <w:pStyle w:val="Heading2"/>
+        <w:keepNext/>
+      </w:pPr>
+      <w:r>
+        <w:t>人工主导事项</w:t>
+      </w:r>
+    </w:p>
+    <w:tbl>
+      <w:tblPr>
+        <w:tblW w:type="auto" w:w="0"/>
+        <w:jc w:val="center"/>
+        <w:tblLayout w:type="fixed"/>
+        <w:tblLook w:firstColumn="1" w:firstRow="1" w:lastColumn="0" w:lastRow="0" w:noHBand="0" w:noVBand="1" w:val="04A0"/>
+        <w:tblBorders>
+          <w:top w:val="single" w:sz="6" w:color="D9D9D9"/>
+          <w:left w:val="single" w:sz="6" w:color="D9D9D9"/>
+          <w:bottom w:val="single" w:sz="6" w:color="D9D9D9"/>
+          <w:right w:val="single" w:sz="6" w:color="D9D9D9"/>
+          <w:insideH w:val="single" w:sz="6" w:color="D9D9D9"/>
+          <w:insideV w:val="single" w:sz="6" w:color="D9D9D9"/>
+        </w:tblBorders>
+        <w:tblCellMar>
+          <w:top w:w="80" w:type="dxa"/>
+          <w:left w:w="80" w:type="dxa"/>
+          <w:bottom w:w="80" w:type="dxa"/>
+          <w:right w:w="80" w:type="dxa"/>
+        </w:tblCellMar>
+      </w:tblPr>
+      <w:tblGrid>
+        <w:gridCol w:w="1984"/>
+        <w:gridCol w:w="7654"/>
+      </w:tblGrid>
+      <w:tr>
+        <w:trPr>
+          <w:cantSplit/>
+          <w:tblHeader/>
+        </w:trPr>
+        <w:tc>
+          <w:tcPr>
+            <w:tcW w:type="dxa" w:w="1984"/>
+            <w:vAlign w:val="center"/>
+            <w:shd w:fill="E8EEF3"/>
+          </w:tcPr>
+          <w:p>
+            <w:pPr>
+              <w:spacing w:line="264" w:lineRule="auto" w:after="0" w:before="0"/>
+              <w:jc w:val="center"/>
+            </w:pPr>
+            <w:r>
+              <w:rPr>
+                <w:rFonts w:ascii="Times New Roman" w:hAnsi="Times New Roman" w:eastAsia="宋体"/>
+                <w:b/>
+                <w:color w:val="000000"/>
+                <w:sz w:val="20"/>
+              </w:rPr>
+              <w:t>核心环节</w:t>
             </w:r>
           </w:p>
         </w:tc>
         <w:tc>
           <w:tcPr>
-            <w:tcW w:type="dxa" w:w="2324"/>
+            <w:tcW w:type="dxa" w:w="7654"/>
+            <w:vAlign w:val="center"/>
+            <w:shd w:fill="E8EEF3"/>
+          </w:tcPr>
+          <w:p>
+            <w:pPr>
+              <w:spacing w:line="264" w:lineRule="auto" w:after="0" w:before="0"/>
+              <w:jc w:val="center"/>
+            </w:pPr>
+            <w:r>
+              <w:rPr>
+                <w:rFonts w:ascii="Times New Roman" w:hAnsi="Times New Roman" w:eastAsia="宋体"/>
+                <w:b/>
+                <w:color w:val="000000"/>
+                <w:sz w:val="20"/>
+              </w:rPr>
+              <w:t>本队承担的工作与责任</w:t>
+            </w:r>
+          </w:p>
+        </w:tc>
+      </w:tr>
+      <w:tr>
+        <w:trPr>
+          <w:cantSplit/>
+        </w:trPr>
+        <w:tc>
+          <w:tcPr>
+            <w:tcW w:type="dxa" w:w="1984"/>
             <w:vAlign w:val="center"/>
           </w:tcPr>
           <w:p>
@@ -3562,28 +2544,169 @@
                 <w:rFonts w:ascii="Times New Roman" w:hAnsi="Times New Roman" w:eastAsia="宋体"/>
                 <w:b w:val="0"/>
                 <w:color w:val="000000"/>
-                <w:sz w:val="21"/>
+                <w:sz w:val="20"/>
               </w:rPr>
-              <w:t>□ 已确认  □ 待确认</w:t>
+              <w:t>模型选型与创新</w:t>
+            </w:r>
+          </w:p>
+        </w:tc>
+        <w:tc>
+          <w:tcPr>
+            <w:tcW w:type="dxa" w:w="7654"/>
+            <w:vAlign w:val="center"/>
+          </w:tcPr>
+          <w:p>
+            <w:pPr>
+              <w:spacing w:line="264" w:lineRule="auto" w:after="0" w:before="0"/>
+            </w:pPr>
+            <w:r>
+              <w:rPr>
+                <w:rFonts w:ascii="Times New Roman" w:hAnsi="Times New Roman" w:eastAsia="宋体"/>
+                <w:b w:val="0"/>
+                <w:color w:val="000000"/>
+                <w:sz w:val="20"/>
+              </w:rPr>
+              <w:t>负责模型路线、假设及创新内容的最终选择，判断AI建议是否适用。</w:t>
+            </w:r>
+          </w:p>
+        </w:tc>
+      </w:tr>
+      <w:tr>
+        <w:trPr>
+          <w:cantSplit/>
+        </w:trPr>
+        <w:tc>
+          <w:tcPr>
+            <w:tcW w:type="dxa" w:w="1984"/>
+            <w:vAlign w:val="center"/>
+          </w:tcPr>
+          <w:p>
+            <w:pPr>
+              <w:spacing w:line="264" w:lineRule="auto" w:after="0" w:before="0"/>
+            </w:pPr>
+            <w:r>
+              <w:rPr>
+                <w:rFonts w:ascii="Times New Roman" w:hAnsi="Times New Roman" w:eastAsia="宋体"/>
+                <w:b w:val="0"/>
+                <w:color w:val="000000"/>
+                <w:sz w:val="20"/>
+              </w:rPr>
+              <w:t>公式推导</w:t>
+            </w:r>
+          </w:p>
+        </w:tc>
+        <w:tc>
+          <w:tcPr>
+            <w:tcW w:type="dxa" w:w="7654"/>
+            <w:vAlign w:val="center"/>
+          </w:tcPr>
+          <w:p>
+            <w:pPr>
+              <w:spacing w:line="264" w:lineRule="auto" w:after="0" w:before="0"/>
+            </w:pPr>
+            <w:r>
+              <w:rPr>
+                <w:rFonts w:ascii="Times New Roman" w:hAnsi="Times New Roman" w:eastAsia="宋体"/>
+                <w:b w:val="0"/>
+                <w:color w:val="000000"/>
+                <w:sz w:val="20"/>
+              </w:rPr>
+              <w:t>负责理解和审查所采用方程、条件、推导及量纲，决定最终表达。</w:t>
+            </w:r>
+          </w:p>
+        </w:tc>
+      </w:tr>
+      <w:tr>
+        <w:trPr>
+          <w:cantSplit/>
+        </w:trPr>
+        <w:tc>
+          <w:tcPr>
+            <w:tcW w:type="dxa" w:w="1984"/>
+            <w:vAlign w:val="center"/>
+          </w:tcPr>
+          <w:p>
+            <w:pPr>
+              <w:spacing w:line="264" w:lineRule="auto" w:after="0" w:before="0"/>
+            </w:pPr>
+            <w:r>
+              <w:rPr>
+                <w:rFonts w:ascii="Times New Roman" w:hAnsi="Times New Roman" w:eastAsia="宋体"/>
+                <w:b w:val="0"/>
+                <w:color w:val="000000"/>
+                <w:sz w:val="20"/>
+              </w:rPr>
+              <w:t>代码逻辑</w:t>
+            </w:r>
+          </w:p>
+        </w:tc>
+        <w:tc>
+          <w:tcPr>
+            <w:tcW w:type="dxa" w:w="7654"/>
+            <w:vAlign w:val="center"/>
+          </w:tcPr>
+          <w:p>
+            <w:pPr>
+              <w:spacing w:line="264" w:lineRule="auto" w:after="0" w:before="0"/>
+            </w:pPr>
+            <w:r>
+              <w:rPr>
+                <w:rFonts w:ascii="Times New Roman" w:hAnsi="Times New Roman" w:eastAsia="宋体"/>
+                <w:b w:val="0"/>
+                <w:color w:val="000000"/>
+                <w:sz w:val="20"/>
+              </w:rPr>
+              <w:t>负责掌握核心程序逻辑并进行人工审查；区分程序运行记录和人工审核结论。</w:t>
+            </w:r>
+          </w:p>
+        </w:tc>
+      </w:tr>
+      <w:tr>
+        <w:trPr>
+          <w:cantSplit/>
+        </w:trPr>
+        <w:tc>
+          <w:tcPr>
+            <w:tcW w:type="dxa" w:w="1984"/>
+            <w:vAlign w:val="center"/>
+          </w:tcPr>
+          <w:p>
+            <w:pPr>
+              <w:spacing w:line="264" w:lineRule="auto" w:after="0" w:before="0"/>
+            </w:pPr>
+            <w:r>
+              <w:rPr>
+                <w:rFonts w:ascii="Times New Roman" w:hAnsi="Times New Roman" w:eastAsia="宋体"/>
+                <w:b w:val="0"/>
+                <w:color w:val="000000"/>
+                <w:sz w:val="20"/>
+              </w:rPr>
+              <w:t>核心论证</w:t>
+            </w:r>
+          </w:p>
+        </w:tc>
+        <w:tc>
+          <w:tcPr>
+            <w:tcW w:type="dxa" w:w="7654"/>
+            <w:vAlign w:val="center"/>
+          </w:tcPr>
+          <w:p>
+            <w:pPr>
+              <w:spacing w:line="264" w:lineRule="auto" w:after="0" w:before="0"/>
+            </w:pPr>
+            <w:r>
+              <w:rPr>
+                <w:rFonts w:ascii="Times New Roman" w:hAnsi="Times New Roman" w:eastAsia="宋体"/>
+                <w:b w:val="0"/>
+                <w:color w:val="000000"/>
+                <w:sz w:val="20"/>
+              </w:rPr>
+              <w:t>负责审查结果解释、适用范围与局限性，决定论文最终结论。</w:t>
             </w:r>
           </w:p>
         </w:tc>
       </w:tr>
     </w:tbl>
-    <w:p>
-      <w:pPr>
-        <w:spacing w:after="80"/>
-      </w:pPr>
-      <w:r>
-        <w:rPr>
-          <w:rFonts w:ascii="Times New Roman" w:hAnsi="Times New Roman" w:eastAsia="宋体"/>
-          <w:b w:val="0"/>
-          <w:color w:val="000000"/>
-          <w:sz w:val="20"/>
-        </w:rPr>
-        <w:t>需补充或更正的事项：待填写；全部核实且无补充时填写“无”。</w:t>
-      </w:r>
-    </w:p>
     <w:p>
       <w:pPr>
         <w:pStyle w:val="Heading2"/>
@@ -3595,16 +2718,16 @@
     </w:p>
     <w:p>
       <w:pPr>
-        <w:spacing w:after="100"/>
+        <w:spacing w:after="120"/>
       </w:pPr>
       <w:r>
         <w:rPr>
           <w:rFonts w:ascii="Times New Roman" w:hAnsi="Times New Roman" w:eastAsia="宋体"/>
           <w:b w:val="0"/>
           <w:color w:val="000000"/>
-          <w:sz w:val="21"/>
+          <w:sz w:val="20"/>
         </w:rPr>
-        <w:t>供本队核实后确认：本队确认，本文件所填 AI 工具、版本、使用环节、交互记录和采纳修改情况与实际过程一致，所附提示词与 AI 回复为真实记录。本队已对采用的内容进行必要的人工核验，并对论文及支撑材料的真实性、准确性和完整性负责。</w:t>
+        <w:t>本队签认本文件时，确认所登记的AI工具、使用环节和采纳情况与实际过程一致，交互节选来自真实对话，并承担论文与支撑材料的真实性、准确性及完整性责任。程序运行和自动检查记录不替代本队对模型、公式、代码及核心论证的人工审查。</w:t>
       </w:r>
     </w:p>
     <w:p>
@@ -3616,9 +2739,9 @@
           <w:rFonts w:ascii="Times New Roman" w:hAnsi="Times New Roman" w:eastAsia="宋体"/>
           <w:b w:val="0"/>
           <w:color w:val="000000"/>
-          <w:sz w:val="21"/>
+          <w:sz w:val="20"/>
         </w:rPr>
-        <w:t>声明确认：□ 已确认  □ 待确认    确认日期：待填写</w:t>
+        <w:t>本队确认签名：________________    日期：________________</w:t>
       </w:r>
     </w:p>
     <w:sectPr>

</xml_diff>

<commit_message>
backup: scheduled 2026-09-13 10:03 UTC
</commit_message>
<xml_diff>
--- a/支撑材料/AI工具使用详情.docx
+++ b/支撑材料/AI工具使用详情.docx
@@ -1395,7 +1395,9 @@
               <w:spacing w:before="0" w:after="0" w:line="264" w:lineRule="auto"/>
               <w:jc w:val="center"/>
               <w:rPr>
-                <w:b w:val="0"/>
+                <w:rFonts w:hint="eastAsia" w:eastAsia="宋体"/>
+                <w:b w:val="0"/>
+                <w:lang w:eastAsia="zh-CN"/>
               </w:rPr>
             </w:pPr>
             <w:r>
@@ -1443,7 +1445,17 @@
                 <w:color w:val="000000"/>
                 <w:sz w:val="21"/>
               </w:rPr>
-              <w:t>。采用位置：论文第9.3节、AI工具使用详情、附录文件列表；实例3。</w:t>
+              <w:t>。采用位置：论文第9.3节、AI工具使用详情、附录文件列表</w:t>
+            </w:r>
+            <w:r>
+              <w:rPr>
+                <w:rFonts w:hint="eastAsia"/>
+                <w:b w:val="0"/>
+                <w:color w:val="000000"/>
+                <w:sz w:val="21"/>
+                <w:lang w:eastAsia="zh-CN"/>
+              </w:rPr>
+              <w:t>。</w:t>
             </w:r>
           </w:p>
         </w:tc>
@@ -2962,14 +2974,7 @@
           <w:rFonts w:hint="eastAsia" w:ascii="黑体" w:hAnsi="黑体" w:eastAsia="黑体" w:cs="黑体"/>
           <w:lang w:eastAsia="zh-CN"/>
         </w:rPr>
-        <w:t>四</w:t>
-      </w:r>
-      <w:r>
-        <w:rPr>
-          <w:rFonts w:hint="eastAsia" w:ascii="黑体" w:hAnsi="黑体" w:eastAsia="黑体" w:cs="黑体"/>
-          <w:lang w:eastAsia="zh-CN"/>
-        </w:rPr>
-        <w:t>、采纳修改及人工主导确认</w:t>
+        <w:t>四、采纳修改及人工主导确认</w:t>
       </w:r>
     </w:p>
     <w:tbl>
@@ -2994,8 +2999,8 @@
         </w:tblCellMar>
       </w:tblPr>
       <w:tblGrid>
-        <w:gridCol w:w="1134"/>
-        <w:gridCol w:w="2835"/>
+        <w:gridCol w:w="1206"/>
+        <w:gridCol w:w="2763"/>
         <w:gridCol w:w="5669"/>
       </w:tblGrid>
       <w:tr>
@@ -3008,12 +3013,6 @@
             <w:insideH w:val="single" w:color="D9D9D9" w:sz="6" w:space="0"/>
             <w:insideV w:val="single" w:color="D9D9D9" w:sz="6" w:space="0"/>
           </w:tblBorders>
-          <w:tblCellMar>
-            <w:top w:w="85" w:type="dxa"/>
-            <w:left w:w="85" w:type="dxa"/>
-            <w:bottom w:w="85" w:type="dxa"/>
-            <w:right w:w="85" w:type="dxa"/>
-          </w:tblCellMar>
         </w:tblPrEx>
         <w:trPr>
           <w:cantSplit/>
@@ -3022,7 +3021,7 @@
         </w:trPr>
         <w:tc>
           <w:tcPr>
-            <w:tcW w:w="1134" w:type="dxa"/>
+            <w:tcW w:w="1206" w:type="dxa"/>
             <w:tcBorders>
               <w:top w:val="single" w:color="000000" w:sz="12" w:space="0"/>
               <w:left w:val="nil"/>
@@ -3050,11 +3049,13 @@
               </w:rPr>
               <w:t>类别</w:t>
             </w:r>
+            <w:bookmarkStart w:id="0" w:name="_GoBack"/>
+            <w:bookmarkEnd w:id="0"/>
           </w:p>
         </w:tc>
         <w:tc>
           <w:tcPr>
-            <w:tcW w:w="2835" w:type="dxa"/>
+            <w:tcW w:w="2763" w:type="dxa"/>
             <w:tcBorders>
               <w:top w:val="single" w:color="000000" w:sz="12" w:space="0"/>
               <w:left w:val="nil"/>
@@ -3138,7 +3139,7 @@
         </w:trPr>
         <w:tc>
           <w:tcPr>
-            <w:tcW w:w="1134" w:type="dxa"/>
+            <w:tcW w:w="1206" w:type="dxa"/>
             <w:tcBorders>
               <w:top w:val="single" w:color="000000" w:sz="4" w:space="0"/>
               <w:left w:val="nil"/>
@@ -3169,7 +3170,7 @@
         </w:tc>
         <w:tc>
           <w:tcPr>
-            <w:tcW w:w="2835" w:type="dxa"/>
+            <w:tcW w:w="2763" w:type="dxa"/>
             <w:tcBorders>
               <w:top w:val="single" w:color="000000" w:sz="4" w:space="0"/>
               <w:left w:val="nil"/>
@@ -3253,7 +3254,7 @@
         </w:trPr>
         <w:tc>
           <w:tcPr>
-            <w:tcW w:w="1134" w:type="dxa"/>
+            <w:tcW w:w="1206" w:type="dxa"/>
             <w:tcBorders>
               <w:top w:val="nil"/>
               <w:left w:val="nil"/>
@@ -3284,7 +3285,7 @@
         </w:tc>
         <w:tc>
           <w:tcPr>
-            <w:tcW w:w="2835" w:type="dxa"/>
+            <w:tcW w:w="2763" w:type="dxa"/>
             <w:tcBorders>
               <w:top w:val="nil"/>
               <w:left w:val="nil"/>
@@ -3368,7 +3369,7 @@
         </w:trPr>
         <w:tc>
           <w:tcPr>
-            <w:tcW w:w="1134" w:type="dxa"/>
+            <w:tcW w:w="1206" w:type="dxa"/>
             <w:tcBorders>
               <w:top w:val="nil"/>
               <w:left w:val="nil"/>
@@ -3399,7 +3400,7 @@
         </w:tc>
         <w:tc>
           <w:tcPr>
-            <w:tcW w:w="2835" w:type="dxa"/>
+            <w:tcW w:w="2763" w:type="dxa"/>
             <w:tcBorders>
               <w:top w:val="nil"/>
               <w:left w:val="nil"/>
@@ -3483,7 +3484,7 @@
         </w:trPr>
         <w:tc>
           <w:tcPr>
-            <w:tcW w:w="1134" w:type="dxa"/>
+            <w:tcW w:w="1206" w:type="dxa"/>
             <w:tcBorders>
               <w:top w:val="nil"/>
               <w:left w:val="nil"/>
@@ -3514,7 +3515,7 @@
         </w:tc>
         <w:tc>
           <w:tcPr>
-            <w:tcW w:w="2835" w:type="dxa"/>
+            <w:tcW w:w="2763" w:type="dxa"/>
             <w:tcBorders>
               <w:top w:val="nil"/>
               <w:left w:val="nil"/>
@@ -3646,12 +3647,6 @@
             <w:insideH w:val="single" w:color="D9D9D9" w:sz="6" w:space="0"/>
             <w:insideV w:val="single" w:color="D9D9D9" w:sz="6" w:space="0"/>
           </w:tblBorders>
-          <w:tblCellMar>
-            <w:top w:w="80" w:type="dxa"/>
-            <w:left w:w="80" w:type="dxa"/>
-            <w:bottom w:w="80" w:type="dxa"/>
-            <w:right w:w="80" w:type="dxa"/>
-          </w:tblCellMar>
         </w:tblPrEx>
         <w:trPr>
           <w:cantSplit/>
@@ -4096,19 +4091,7 @@
           <w:sz w:val="24"/>
           <w:szCs w:val="24"/>
         </w:rPr>
-        <w:t>本队确认所登记的AI工具、使用环节和采纳情况与实际过程一致，交互节选来自真</w:t>
-      </w:r>
-      <w:bookmarkStart w:id="0" w:name="_GoBack"/>
-      <w:bookmarkEnd w:id="0"/>
-      <w:r>
-        <w:rPr>
-          <w:rFonts w:hint="eastAsia" w:ascii="新宋体" w:hAnsi="新宋体" w:eastAsia="新宋体" w:cs="新宋体"/>
-          <w:b w:val="0"/>
-          <w:color w:val="000000"/>
-          <w:sz w:val="24"/>
-          <w:szCs w:val="24"/>
-        </w:rPr>
-        <w:t>实对话，并承担论文与支撑材料的真实性、准确性及完整性责任。程序运行和自动检查记录不替代本队对模型、公式、代码及核心论证的人工审查。</w:t>
+        <w:t>本队确认所登记的AI工具、使用环节和采纳情况与实际过程一致，交互节选来自真实对话，并承担论文与支撑材料的真实性、准确性及完整性责任。程序运行和自动检查记录不替代本队对模型、公式、代码及核心论证的人工审查。</w:t>
       </w:r>
     </w:p>
     <w:p>
@@ -4442,17 +4425,17 @@
     <w:lsdException w:uiPriority="99" w:name="endnote reference"/>
     <w:lsdException w:uiPriority="99" w:name="endnote text"/>
     <w:lsdException w:uiPriority="99" w:name="table of authorities"/>
-    <w:lsdException w:uiPriority="99" w:semiHidden="0" w:name="macro"/>
+    <w:lsdException w:qFormat="1" w:uiPriority="99" w:semiHidden="0" w:name="macro"/>
     <w:lsdException w:uiPriority="99" w:name="toa heading"/>
     <w:lsdException w:uiPriority="99" w:semiHidden="0" w:name="List"/>
     <w:lsdException w:qFormat="1" w:uiPriority="99" w:semiHidden="0" w:name="List Bullet"/>
-    <w:lsdException w:uiPriority="99" w:semiHidden="0" w:name="List Number"/>
-    <w:lsdException w:uiPriority="99" w:semiHidden="0" w:name="List 2"/>
+    <w:lsdException w:qFormat="1" w:uiPriority="99" w:semiHidden="0" w:name="List Number"/>
+    <w:lsdException w:qFormat="1" w:uiPriority="99" w:semiHidden="0" w:name="List 2"/>
     <w:lsdException w:uiPriority="99" w:semiHidden="0" w:name="List 3"/>
     <w:lsdException w:uiPriority="99" w:name="List 4"/>
     <w:lsdException w:uiPriority="99" w:name="List 5"/>
     <w:lsdException w:uiPriority="99" w:semiHidden="0" w:name="List Bullet 2"/>
-    <w:lsdException w:uiPriority="99" w:semiHidden="0" w:name="List Bullet 3"/>
+    <w:lsdException w:qFormat="1" w:uiPriority="99" w:semiHidden="0" w:name="List Bullet 3"/>
     <w:lsdException w:uiPriority="99" w:name="List Bullet 4"/>
     <w:lsdException w:uiPriority="99" w:name="List Bullet 5"/>
     <w:lsdException w:uiPriority="99" w:semiHidden="0" w:name="List Number 2"/>
@@ -4552,7 +4535,7 @@
     <w:lsdException w:qFormat="1" w:unhideWhenUsed="0" w:uiPriority="61" w:semiHidden="0" w:name="Light List"/>
     <w:lsdException w:qFormat="1" w:unhideWhenUsed="0" w:uiPriority="62" w:semiHidden="0" w:name="Light Grid"/>
     <w:lsdException w:qFormat="1" w:unhideWhenUsed="0" w:uiPriority="63" w:semiHidden="0" w:name="Medium Shading 1"/>
-    <w:lsdException w:unhideWhenUsed="0" w:uiPriority="64" w:semiHidden="0" w:name="Medium Shading 2"/>
+    <w:lsdException w:qFormat="1" w:unhideWhenUsed="0" w:uiPriority="64" w:semiHidden="0" w:name="Medium Shading 2"/>
     <w:lsdException w:qFormat="1" w:unhideWhenUsed="0" w:uiPriority="65" w:semiHidden="0" w:name="Medium List 1"/>
     <w:lsdException w:qFormat="1" w:unhideWhenUsed="0" w:uiPriority="66" w:semiHidden="0" w:name="Medium List 2"/>
     <w:lsdException w:qFormat="1" w:unhideWhenUsed="0" w:uiPriority="67" w:semiHidden="0" w:name="Medium Grid 1"/>
@@ -4921,6 +4904,7 @@
     <w:name w:val="macro"/>
     <w:link w:val="147"/>
     <w:unhideWhenUsed/>
+    <w:qFormat/>
     <w:uiPriority w:val="99"/>
     <w:pPr>
       <w:tabs>
@@ -4968,6 +4952,7 @@
     <w:name w:val="List Number"/>
     <w:basedOn w:val="1"/>
     <w:unhideWhenUsed/>
+    <w:qFormat/>
     <w:uiPriority w:val="99"/>
     <w:pPr>
       <w:numPr>
@@ -5033,6 +5018,7 @@
     <w:name w:val="List Bullet 3"/>
     <w:basedOn w:val="1"/>
     <w:unhideWhenUsed/>
+    <w:qFormat/>
     <w:uiPriority w:val="99"/>
     <w:pPr>
       <w:numPr>
@@ -5069,6 +5055,7 @@
     <w:name w:val="List 2"/>
     <w:basedOn w:val="1"/>
     <w:unhideWhenUsed/>
+    <w:qFormat/>
     <w:uiPriority w:val="99"/>
     <w:pPr>
       <w:ind w:left="720" w:hanging="360"/>
@@ -8236,6 +8223,7 @@
   <w:style w:type="table" w:styleId="62">
     <w:name w:val="Medium Shading 2"/>
     <w:basedOn w:val="32"/>
+    <w:qFormat/>
     <w:uiPriority w:val="64"/>
     <w:pPr>
       <w:spacing w:after="0" w:line="240" w:lineRule="auto"/>
@@ -16748,6 +16736,7 @@
     <w:name w:val="Header Char"/>
     <w:basedOn w:val="132"/>
     <w:link w:val="25"/>
+    <w:qFormat/>
     <w:uiPriority w:val="99"/>
   </w:style>
   <w:style w:type="character" w:customStyle="1" w:styleId="136">
@@ -16841,6 +16830,7 @@
     <w:name w:val="Subtitle Char"/>
     <w:basedOn w:val="132"/>
     <w:link w:val="26"/>
+    <w:qFormat/>
     <w:uiPriority w:val="11"/>
     <w:rPr>
       <w:rFonts w:asciiTheme="majorHAnsi" w:hAnsiTheme="majorHAnsi" w:eastAsiaTheme="majorEastAsia" w:cstheme="majorBidi"/>
@@ -16871,18 +16861,21 @@
     <w:name w:val="Body Text Char"/>
     <w:basedOn w:val="132"/>
     <w:link w:val="19"/>
+    <w:qFormat/>
     <w:uiPriority w:val="99"/>
   </w:style>
   <w:style w:type="character" w:customStyle="1" w:styleId="145">
     <w:name w:val="Body Text 2 Char"/>
     <w:basedOn w:val="132"/>
     <w:link w:val="28"/>
+    <w:qFormat/>
     <w:uiPriority w:val="99"/>
   </w:style>
   <w:style w:type="character" w:customStyle="1" w:styleId="146">
     <w:name w:val="Body Text 3 Char"/>
     <w:basedOn w:val="132"/>
     <w:link w:val="17"/>
+    <w:qFormat/>
     <w:uiPriority w:val="99"/>
     <w:rPr>
       <w:sz w:val="16"/>
@@ -16923,6 +16916,7 @@
     <w:name w:val="Quote Char"/>
     <w:basedOn w:val="132"/>
     <w:link w:val="148"/>
+    <w:qFormat/>
     <w:uiPriority w:val="29"/>
     <w:rPr>
       <w:i/>
@@ -16960,6 +16954,7 @@
     <w:basedOn w:val="132"/>
     <w:link w:val="7"/>
     <w:semiHidden/>
+    <w:qFormat/>
     <w:uiPriority w:val="9"/>
     <w:rPr>
       <w:rFonts w:asciiTheme="majorHAnsi" w:hAnsiTheme="majorHAnsi" w:eastAsiaTheme="majorEastAsia" w:cstheme="majorBidi"/>
@@ -16971,6 +16966,7 @@
     <w:basedOn w:val="132"/>
     <w:link w:val="8"/>
     <w:semiHidden/>
+    <w:qFormat/>
     <w:uiPriority w:val="9"/>
     <w:rPr>
       <w:rFonts w:asciiTheme="majorHAnsi" w:hAnsiTheme="majorHAnsi" w:eastAsiaTheme="majorEastAsia" w:cstheme="majorBidi"/>
@@ -16984,6 +16980,7 @@
     <w:basedOn w:val="132"/>
     <w:link w:val="9"/>
     <w:semiHidden/>
+    <w:qFormat/>
     <w:uiPriority w:val="9"/>
     <w:rPr>
       <w:rFonts w:asciiTheme="majorHAnsi" w:hAnsiTheme="majorHAnsi" w:eastAsiaTheme="majorEastAsia" w:cstheme="majorBidi"/>
@@ -17024,6 +17021,7 @@
     <w:basedOn w:val="132"/>
     <w:link w:val="11"/>
     <w:semiHidden/>
+    <w:qFormat/>
     <w:uiPriority w:val="9"/>
     <w:rPr>
       <w:rFonts w:asciiTheme="majorHAnsi" w:hAnsiTheme="majorHAnsi" w:eastAsiaTheme="majorEastAsia" w:cstheme="majorBidi"/>

</xml_diff>